<commit_message>
Update audit .docx (ed. 2): add InfoSec section, three-way comparison, recalibrate РСП finding
- New section 5 "Информационная безопасность": confirmed internal-infra disclosure
  (10.61.42.188 / 10.61.41.253 + node1.rsp.gov.kz and contractor contact in a
  top-of-page HTML comment); severity calibrated (info/low-to-medium).
- РСП BIN/IIN finding DOWNGRADED from "high-severity PII leak" to a data-governance
  observation (bulk enumerability), since a public statutory registry displaying the
  subject identifier is by-design; wording corrected with an explicit retraction note.
- New section 13 comparing this audit vs Gemini vs Qwen (facts, legal grounding,
  what each got right/wrong), plus Qwen's formal-vs-substantive framing in scores.
- Recommendations extended with the InfoSec cleanup and optional anti-enumeration item.

Co-Authored-By: Claude Fable 5 <noreply@anthropic.com>
Claude-Session: https://claude.ai/code/session_01CB6mNZscycJfpBtPLQVGLv
</commit_message>
<xml_diff>
--- a/rsp-audit/RSP_gov_kz_Audit_Report.docx
+++ b/rsp-audit/RSP_gov_kz_Audit_Report.docx
@@ -4,7 +4,7 @@
   <w:body>
     <w:p>
       <w:pPr>
-        <w:spacing w:after="120" w:before="1200"/>
+        <w:spacing w:after="120" w:before="1000"/>
         <w:jc w:val="center"/>
       </w:pPr>
       <w:r>
@@ -20,7 +20,7 @@
     </w:p>
     <w:p>
       <w:pPr>
-        <w:spacing w:after="400"/>
+        <w:spacing w:after="360"/>
         <w:jc w:val="center"/>
       </w:pPr>
       <w:r>
@@ -48,7 +48,7 @@
     </w:p>
     <w:p>
       <w:pPr>
-        <w:spacing w:after="600"/>
+        <w:spacing w:after="360"/>
         <w:jc w:val="center"/>
       </w:pPr>
       <w:r>
@@ -58,6 +58,22 @@
           <w:szCs w:val="26"/>
         </w:rPr>
         <w:t xml:space="preserve">https://rsp.gov.kz</w:t>
+      </w:r>
+    </w:p>
+    <w:p>
+      <w:pPr>
+        <w:spacing w:after="120"/>
+        <w:jc w:val="center"/>
+      </w:pPr>
+      <w:r>
+        <w:rPr>
+          <w:i/>
+          <w:iCs/>
+          <w:color w:val="B26A00"/>
+          <w:sz w:val="20"/>
+          <w:szCs w:val="20"/>
+        </w:rPr>
+        <w:t xml:space="preserve">Редакция 2 — добавлен раздел информационной безопасности и сравнение с независимыми заключениями (Gemini, Qwen)</w:t>
       </w:r>
     </w:p>
     <w:p>
@@ -513,7 +529,7 @@
                 <w:sz w:val="18"/>
                 <w:szCs w:val="18"/>
               </w:rPr>
-              <w:t xml:space="preserve">80 карточек регуляторных актов (стр. 1–8) + целевые поисковые запросы; проверено более 20 различных документов (кодексы, законы, подзаконные акты)</w:t>
+              <w:t xml:space="preserve">80 карточек регуляторных актов (стр. 1–8) + целевые поисковые запросы + разделы-суб-реестры; проверено более 20 различных документов</w:t>
             </w:r>
           </w:p>
         </w:tc>
@@ -537,7 +553,7 @@
           <w:sz w:val="22"/>
           <w:szCs w:val="22"/>
         </w:rPr>
-        <w:t xml:space="preserve">При работе через сетевой шлюз аудита Chromium по умолчанию не устанавливал TLS-соединение (сброс на этапе TLS 1.3 ClientHello — ERR_CONNECTION_RESET). Диагностика через net-log показала причиной крупный постквантовый ClientHello. Решение — принудительное ограничение --ssl-version-max=tls1.2. Это особенность среды аудита, а не дефект портала.</w:t>
+        <w:t xml:space="preserve">При работе через сетевой шлюз аудита Chromium по умолчанию не устанавливал TLS-соединение (сброс на TLS 1.3 ClientHello — ERR_CONNECTION_RESET). Диагностика через net-log показала причиной крупный постквантовый ClientHello. Решение — ограничение --ssl-version-max=tls1.2. Это особенность среды аудита, а не дефект портала.</w:t>
       </w:r>
     </w:p>
     <w:p>
@@ -808,8 +824,10 @@
             </w:pPr>
             <w:r>
               <w:rPr>
-                <w:sz w:val="18"/>
-                <w:szCs w:val="18"/>
+                <w:b/>
+                <w:bCs/>
+                <w:sz w:val="22"/>
+                <w:szCs w:val="22"/>
               </w:rPr>
               <w:t xml:space="preserve">Классический серверный рендеринг (SSR), НЕ SPA</w:t>
             </w:r>
@@ -932,7 +950,7 @@
                 <w:sz w:val="18"/>
                 <w:szCs w:val="18"/>
               </w:rPr>
-              <w:t xml:space="preserve">Маршрутизация</w:t>
+              <w:t xml:space="preserve">Разработчик</w:t>
             </w:r>
           </w:p>
         </w:tc>
@@ -955,7 +973,7 @@
                 <w:sz w:val="18"/>
                 <w:szCs w:val="18"/>
               </w:rPr>
-              <w:t xml:space="preserve">Серверная (/ru, /ru?page=N, /ru/search?q=)</w:t>
+              <w:t xml:space="preserve">SoftDeCo (раскрыт в HTML-комментарии — см. раздел 5)</w:t>
             </w:r>
           </w:p>
         </w:tc>
@@ -980,7 +998,7 @@
                 <w:sz w:val="18"/>
                 <w:szCs w:val="18"/>
               </w:rPr>
-              <w:t xml:space="preserve">Локализация</w:t>
+              <w:t xml:space="preserve">Маршрутизация</w:t>
             </w:r>
           </w:p>
         </w:tc>
@@ -1003,7 +1021,55 @@
                 <w:sz w:val="18"/>
                 <w:szCs w:val="18"/>
               </w:rPr>
-              <w:t xml:space="preserve">/ → 302 → /kz; переключатель RU/KZ</w:t>
+              <w:t xml:space="preserve">Серверная (/ru, /ru?page=N, /ru/search?q=)</w:t>
+            </w:r>
+          </w:p>
+        </w:tc>
+      </w:tr>
+      <w:tr>
+        <w:tc>
+          <w:tcPr>
+            <w:tcW w:type="dxa" w:w="3200"/>
+            <w:tcMar>
+              <w:top w:type="dxa" w:w="40"/>
+              <w:left w:type="dxa" w:w="80"/>
+              <w:bottom w:type="dxa" w:w="40"/>
+              <w:right w:type="dxa" w:w="80"/>
+            </w:tcMar>
+          </w:tcPr>
+          <w:p>
+            <w:pPr>
+              <w:jc w:val="left"/>
+            </w:pPr>
+            <w:r>
+              <w:rPr>
+                <w:sz w:val="18"/>
+                <w:szCs w:val="18"/>
+              </w:rPr>
+              <w:t xml:space="preserve">Служебные эндпоинты</w:t>
+            </w:r>
+          </w:p>
+        </w:tc>
+        <w:tc>
+          <w:tcPr>
+            <w:tcW w:type="dxa" w:w="5400"/>
+            <w:tcMar>
+              <w:top w:type="dxa" w:w="40"/>
+              <w:left w:type="dxa" w:w="80"/>
+              <w:bottom w:type="dxa" w:w="40"/>
+              <w:right w:type="dxa" w:w="80"/>
+            </w:tcMar>
+          </w:tcPr>
+          <w:p>
+            <w:pPr>
+              <w:jc w:val="left"/>
+            </w:pPr>
+            <w:r>
+              <w:rPr>
+                <w:sz w:val="18"/>
+                <w:szCs w:val="18"/>
+              </w:rPr>
+              <w:t xml:space="preserve">/ru/login (вход госорганов — ЭЦП/NCALayer/QR/FaceID/eGov), /ru/certificate (справка о категории с ЭЦП)</w:t>
             </w:r>
           </w:p>
         </w:tc>
@@ -1027,7 +1093,7 @@
           <w:sz w:val="22"/>
           <w:szCs w:val="22"/>
         </w:rPr>
-        <w:t xml:space="preserve">Портал объединяет несколько независимых реестров. Дефект относится только к разделу «Регуляторные акты» (собственно реестр требований); прочие реестры внутренних IP-ссылок не содержат.</w:t>
+        <w:t xml:space="preserve">Портал объединяет несколько независимых реестров. Дефект внутренних IP относится только к разделу «Регуляторные акты»; прочие реестры внутренних IP-ссылок не содержат.</w:t>
       </w:r>
     </w:p>
     <w:tbl>
@@ -1226,7 +1292,7 @@
                 <w:sz w:val="18"/>
                 <w:szCs w:val="18"/>
               </w:rPr>
-              <w:t xml:space="preserve">Проверки бизнеса</w:t>
+              <w:t xml:space="preserve">Проверки бизнеса (/plan)</w:t>
             </w:r>
           </w:p>
         </w:tc>
@@ -1297,7 +1363,7 @@
                 <w:sz w:val="18"/>
                 <w:szCs w:val="18"/>
               </w:rPr>
-              <w:t xml:space="preserve">РСП (субъекты предпр.)</w:t>
+              <w:t xml:space="preserve">РСП — субъекты предпр. (/rsp)</w:t>
             </w:r>
           </w:p>
         </w:tc>
@@ -1343,7 +1409,7 @@
                 <w:sz w:val="18"/>
                 <w:szCs w:val="18"/>
               </w:rPr>
-              <w:t xml:space="preserve">Отдельный реестр</w:t>
+              <w:t xml:space="preserve">Отдельный реестр (см. раздел 5.2)</w:t>
             </w:r>
           </w:p>
         </w:tc>
@@ -1368,7 +1434,7 @@
                 <w:sz w:val="18"/>
                 <w:szCs w:val="18"/>
               </w:rPr>
-              <w:t xml:space="preserve">РССП (соц. предпр.)</w:t>
+              <w:t xml:space="preserve">РССП — соц. предпр. (/rssp)</w:t>
             </w:r>
           </w:p>
         </w:tc>
@@ -1439,7 +1505,7 @@
                 <w:sz w:val="18"/>
                 <w:szCs w:val="18"/>
               </w:rPr>
-              <w:t xml:space="preserve">РСРО (саморег. орг.)</w:t>
+              <w:t xml:space="preserve">РСРО — саморег. орг. (/organizations)</w:t>
             </w:r>
           </w:p>
         </w:tc>
@@ -1510,7 +1576,7 @@
                 <w:sz w:val="18"/>
                 <w:szCs w:val="18"/>
               </w:rPr>
-              <w:t xml:space="preserve">РДПО (доверенное ПО)</w:t>
+              <w:t xml:space="preserve">РДПО — доверенное ПО (/rdpo)</w:t>
             </w:r>
           </w:p>
         </w:tc>
@@ -1581,7 +1647,7 @@
                 <w:sz w:val="18"/>
                 <w:szCs w:val="18"/>
               </w:rPr>
-              <w:t xml:space="preserve">РМГП (меры господдержки)</w:t>
+              <w:t xml:space="preserve">РМГП — меры господдержки (/rmgp)</w:t>
             </w:r>
           </w:p>
         </w:tc>
@@ -1652,7 +1718,7 @@
                 <w:sz w:val="18"/>
                 <w:szCs w:val="18"/>
               </w:rPr>
-              <w:t xml:space="preserve">РНПО (неправит. орг.)</w:t>
+              <w:t xml:space="preserve">РНПО — неправит. орг. (/rnpo)</w:t>
             </w:r>
           </w:p>
         </w:tc>
@@ -1722,7 +1788,7 @@
           <w:sz w:val="22"/>
           <w:szCs w:val="22"/>
         </w:rPr>
-        <w:t xml:space="preserve">Раздел «Регуляторные акты» хранит только: (1) наименование акта, (2) метку статуса, (3) гиперссылку на текст акта во внешней системе. Сам текст обязательных требований в реестре не хранится.</w:t>
+        <w:t xml:space="preserve">Раздел «Регуляторные акты» хранит только: (1) наименование акта, (2) метку статуса, (3) гиперссылку на текст акта. Сам текст обязательных требований в реестре не хранится.</w:t>
       </w:r>
     </w:p>
     <w:p>
@@ -1743,19 +1809,7 @@
           <w:sz w:val="22"/>
           <w:szCs w:val="22"/>
         </w:rPr>
-        <w:t xml:space="preserve">Каждый акт представлен блоком .registry-item. Кнопка «Подробнее»/«Данные» — это JS-аккордеон: она не ведёт на отдельную страницу и не выполняет сетевых запросов, а лишь раскрывает уже присутствующую в HTML таблицу.</w:t>
-      </w:r>
-    </w:p>
-    <w:p>
-      <w:pPr>
-        <w:spacing w:after="120" w:line="276"/>
-      </w:pPr>
-      <w:r>
-        <w:rPr>
-          <w:sz w:val="22"/>
-          <w:szCs w:val="22"/>
-        </w:rPr>
-        <w:t xml:space="preserve">Раскрытая таблица содержит колонки: Регуляторный акт | ОКЭД | Досье | Регуляторный орган | Статус | Срок проведения анализа. Фактическое наполнение по всем 80 карточкам:</w:t>
+        <w:t xml:space="preserve">Кнопка «Подробнее»/«Данные» — JS-аккордеон: не ведёт на отдельную страницу и не выполняет сетевых запросов, а раскрывает уже присутствующую в HTML таблицу (Регуляторный акт | ОКЭД | Досье | Регуляторный орган | Статус | Срок анализа).</w:t>
       </w:r>
     </w:p>
     <w:tbl>
@@ -2068,7 +2122,7 @@
                 <w:sz w:val="18"/>
                 <w:szCs w:val="18"/>
               </w:rPr>
-              <w:t xml:space="preserve">«Действующий» (единственное встреченное значение — 2 011 из 2 011 строк)</w:t>
+              <w:t xml:space="preserve">«Действующий» (единственное встреченное значение)</w:t>
             </w:r>
           </w:p>
         </w:tc>
@@ -2181,7 +2235,7 @@
           <w:sz w:val="18"/>
           <w:szCs w:val="18"/>
         </w:rPr>
-        <w:t xml:space="preserve">Скриншот 1. Раскрытая карточка акта: метаданные пусты, «Регуляторный орган» — «Отсутствует», статус — «Действующий».</w:t>
+        <w:t xml:space="preserve">Скриншот 1. Раскрытая карточка акта: метаданные пусты, «Регуляторный орган» — «Отсутствует».</w:t>
       </w:r>
     </w:p>
     <w:p>
@@ -2617,6 +2671,9 @@
             </w:pPr>
             <w:r>
               <w:rPr>
+                <w:b/>
+                <w:bCs/>
+                <w:color w:val="2E7D32"/>
                 <w:sz w:val="18"/>
                 <w:szCs w:val="18"/>
               </w:rPr>
@@ -2731,14 +2788,14 @@
           <w:sz w:val="22"/>
           <w:szCs w:val="22"/>
         </w:rPr>
-        <w:t xml:space="preserve">Итого: 2 361 из 2 692 ссылок (≈ 87,7 %) ведут на приватные IP-адреса RFC 1918 (10.0.0.0/8), не маршрутизируемые в публичной сети. </w:t>
+        <w:t xml:space="preserve">Итого: 2 361 из 2 692 ссылок (≈ 87,7 %) ведут на приватные IP RFC 1918, не маршрутизируемые в публичной сети. </w:t>
       </w:r>
       <w:r>
         <w:rPr>
           <w:sz w:val="22"/>
           <w:szCs w:val="22"/>
         </w:rPr>
-        <w:t xml:space="preserve">На главной странице картина аналогична: из 1 262 ссылок 903 (≈ 72 %) — на внутренние IP. Проблема сквозная и охватывает кодексы, законы, постановления и приказы.</w:t>
+        <w:t xml:space="preserve">На главной картина аналогична: 903 из 1 262 (≈ 72 %). Проблема охватывает кодексы, законы, постановления и приказы.</w:t>
       </w:r>
     </w:p>
     <w:p>
@@ -2924,7 +2981,7 @@
                 <w:sz w:val="18"/>
                 <w:szCs w:val="18"/>
               </w:rPr>
-              <w:t xml:space="preserve">ERR_TUNNEL_CONNECTION_FAILED — «This site can’t be reached»</w:t>
+              <w:t xml:space="preserve">ERR_TUNNEL_CONNECTION_FAILED</w:t>
             </w:r>
           </w:p>
         </w:tc>
@@ -3206,7 +3263,7 @@
                 <w:sz w:val="18"/>
                 <w:szCs w:val="18"/>
               </w:rPr>
-              <w:t xml:space="preserve">Страница «404 NOT FOUND»</w:t>
+              <w:t xml:space="preserve">«404 NOT FOUND»</w:t>
             </w:r>
           </w:p>
         </w:tc>
@@ -3384,13 +3441,597 @@
     </w:p>
     <w:p>
       <w:pPr>
+        <w:pStyle w:val="Heading2"/>
+        <w:spacing w:after="100" w:before="220"/>
+      </w:pPr>
+      <w:r>
+        <w:t xml:space="preserve">4.3. Содержимое: хранит ли реестр сами требования?</w:t>
+      </w:r>
+    </w:p>
+    <w:p>
+      <w:pPr>
+        <w:spacing w:after="120" w:line="276"/>
+      </w:pPr>
+      <w:r>
+        <w:rPr>
+          <w:b/>
+          <w:bCs/>
+          <w:sz w:val="22"/>
+          <w:szCs w:val="22"/>
+        </w:rPr>
+        <w:t xml:space="preserve">Нет. </w:t>
+      </w:r>
+      <w:r>
+        <w:rPr>
+          <w:sz w:val="22"/>
+          <w:szCs w:val="22"/>
+        </w:rPr>
+        <w:t xml:space="preserve">Реестр не содержит текста требований и выступает указателем ссылок. 87,7 % ссылок недоступны извне; 12,2 % дублируют публичный adilet.zan.kz.</w:t>
+      </w:r>
+    </w:p>
+    <w:p>
+      <w:r>
+        <w:br w:type="page"/>
+      </w:r>
+    </w:p>
+    <w:p>
+      <w:pPr>
+        <w:pStyle w:val="Heading1"/>
+        <w:spacing w:after="120" w:before="280"/>
+      </w:pPr>
+      <w:r>
+        <w:t xml:space="preserve">5. Информационная безопасность: находки и калибровка серьёзности</w:t>
+      </w:r>
+    </w:p>
+    <w:p>
+      <w:pPr>
+        <w:spacing w:after="120" w:line="276"/>
+      </w:pPr>
+      <w:r>
+        <w:rPr>
+          <w:sz w:val="22"/>
+          <w:szCs w:val="22"/>
+        </w:rPr>
+        <w:t xml:space="preserve">В независимых заключениях (Gemini, Qwen) отмечались два ИБ-момента: раскрытие внутренней инфраструктуры и наличие ИИН/БИН. Ниже — проверенные по факту наблюдения и честная (не завышенная) калибровка серьёзности каждого.</w:t>
+      </w:r>
+    </w:p>
+    <w:p>
+      <w:pPr>
+        <w:pStyle w:val="Heading2"/>
+        <w:spacing w:after="100" w:before="220"/>
+      </w:pPr>
+      <w:r>
+        <w:t xml:space="preserve">5.1. Раскрытие внутренней инфраструктуры в публичном коде — ПОДТВЕРЖДЕНО</w:t>
+      </w:r>
+    </w:p>
+    <w:p>
+      <w:pPr>
+        <w:spacing w:after="120" w:line="276"/>
+      </w:pPr>
+      <w:r>
+        <w:rPr>
+          <w:b/>
+          <w:bCs/>
+          <w:sz w:val="22"/>
+          <w:szCs w:val="22"/>
+        </w:rPr>
+        <w:t xml:space="preserve">(а) Внутренние IP-адреса. </w:t>
+      </w:r>
+      <w:r>
+        <w:rPr>
+          <w:sz w:val="22"/>
+          <w:szCs w:val="22"/>
+        </w:rPr>
+        <w:t xml:space="preserve">Адреса 10.61.42.188 и 10.61.41.253 зашиты в отдаваемый публично HTML (см. раздел 4). Это одновременно Information Disclosure (раскрытие топологии внутренней сети) и первопричина неработающих ссылок.</w:t>
+      </w:r>
+    </w:p>
+    <w:p>
+      <w:pPr>
+        <w:spacing w:after="120" w:line="276"/>
+      </w:pPr>
+      <w:r>
+        <w:rPr>
+          <w:b/>
+          <w:bCs/>
+          <w:sz w:val="22"/>
+          <w:szCs w:val="22"/>
+        </w:rPr>
+        <w:t xml:space="preserve">(б) Имя backend-узла и подрядчик. </w:t>
+      </w:r>
+      <w:r>
+        <w:rPr>
+          <w:sz w:val="22"/>
+          <w:szCs w:val="22"/>
+        </w:rPr>
+        <w:t xml:space="preserve">В начале КАЖДОЙ страницы (до &lt;!doctype html&gt;) присутствует HTML-комментарий:</w:t>
+      </w:r>
+    </w:p>
+    <w:p>
+      <w:pPr>
+        <w:pBdr>
+          <w:top w:val="single" w:color="CCCCCC" w:sz="2"/>
+          <w:bottom w:val="single" w:color="CCCCCC" w:sz="2"/>
+          <w:left w:val="single" w:color="CCCCCC" w:sz="2"/>
+          <w:right w:val="single" w:color="CCCCCC" w:sz="2"/>
+        </w:pBdr>
+        <w:shd w:fill="F2F2F2" w:color="auto" w:val="clear"/>
+        <w:spacing w:after="120"/>
+      </w:pPr>
+      <w:r>
+        <w:rPr>
+          <w:rFonts w:ascii="Consolas" w:cs="Consolas" w:eastAsia="Consolas" w:hAnsi="Consolas"/>
+          <w:sz w:val="18"/>
+          <w:szCs w:val="18"/>
+        </w:rPr>
+        <w:t xml:space="preserve">&lt;!--</w:t>
+      </w:r>
+      <w:r>
+        <w:rPr>
+          <w:rFonts w:ascii="Consolas" w:cs="Consolas" w:eastAsia="Consolas" w:hAnsi="Consolas"/>
+          <w:sz w:val="18"/>
+          <w:szCs w:val="18"/>
+        </w:rPr>
+        <w:br/>
+        <w:t xml:space="preserve">  Разработка компании SoftDeCo</w:t>
+      </w:r>
+      <w:r>
+        <w:rPr>
+          <w:rFonts w:ascii="Consolas" w:cs="Consolas" w:eastAsia="Consolas" w:hAnsi="Consolas"/>
+          <w:sz w:val="18"/>
+          <w:szCs w:val="18"/>
+        </w:rPr>
+        <w:br/>
+        <w:t xml:space="preserve">  Все права защищены (с) 2023-2025</w:t>
+      </w:r>
+      <w:r>
+        <w:rPr>
+          <w:rFonts w:ascii="Consolas" w:cs="Consolas" w:eastAsia="Consolas" w:hAnsi="Consolas"/>
+          <w:sz w:val="18"/>
+          <w:szCs w:val="18"/>
+        </w:rPr>
+        <w:br/>
+        <w:t xml:space="preserve">  e-mail: office@softdeco.com</w:t>
+      </w:r>
+      <w:r>
+        <w:rPr>
+          <w:rFonts w:ascii="Consolas" w:cs="Consolas" w:eastAsia="Consolas" w:hAnsi="Consolas"/>
+          <w:sz w:val="18"/>
+          <w:szCs w:val="18"/>
+        </w:rPr>
+        <w:br/>
+        <w:t xml:space="preserve">  сервер: node1.rsp.gov.kz</w:t>
+      </w:r>
+      <w:r>
+        <w:rPr>
+          <w:rFonts w:ascii="Consolas" w:cs="Consolas" w:eastAsia="Consolas" w:hAnsi="Consolas"/>
+          <w:sz w:val="18"/>
+          <w:szCs w:val="18"/>
+        </w:rPr>
+        <w:br/>
+        <w:t xml:space="preserve">--&gt;</w:t>
+      </w:r>
+    </w:p>
+    <w:p>
+      <w:pPr>
+        <w:spacing w:after="120" w:line="276"/>
+      </w:pPr>
+      <w:r>
+        <w:rPr>
+          <w:sz w:val="22"/>
+          <w:szCs w:val="22"/>
+        </w:rPr>
+        <w:t xml:space="preserve">Раскрывается: имя внутреннего узла node1.rsp.gov.kz (само «node1» указывает на кластер node1/node2…), подрядчик SoftDeCo и его e-mail (полезно для целевого фишинга/социальной инженерии).</w:t>
+      </w:r>
+    </w:p>
+    <w:tbl>
+      <w:tblPr>
+        <w:tblW w:type="dxa" w:w="8600"/>
+        <w:tblBorders>
+          <w:top w:val="single" w:color="BBBBBB" w:sz="4"/>
+          <w:left w:val="single" w:color="BBBBBB" w:sz="4"/>
+          <w:bottom w:val="single" w:color="BBBBBB" w:sz="4"/>
+          <w:right w:val="single" w:color="BBBBBB" w:sz="4"/>
+          <w:insideH w:val="single" w:color="BBBBBB" w:sz="4"/>
+          <w:insideV w:val="single" w:color="BBBBBB" w:sz="4"/>
+        </w:tblBorders>
+      </w:tblPr>
+      <w:tblGrid>
+        <w:gridCol w:w="3400"/>
+        <w:gridCol w:w="1500"/>
+        <w:gridCol w:w="3700"/>
+      </w:tblGrid>
+      <w:tr>
+        <w:trPr>
+          <w:tblHeader/>
+        </w:trPr>
+        <w:tc>
+          <w:tcPr>
+            <w:tcW w:type="dxa" w:w="3400"/>
+            <w:shd w:fill="1F3864" w:color="auto" w:val="clear"/>
+            <w:tcMar>
+              <w:top w:type="dxa" w:w="40"/>
+              <w:left w:type="dxa" w:w="80"/>
+              <w:bottom w:type="dxa" w:w="40"/>
+              <w:right w:type="dxa" w:w="80"/>
+            </w:tcMar>
+          </w:tcPr>
+          <w:p>
+            <w:pPr>
+              <w:jc w:val="left"/>
+            </w:pPr>
+            <w:r>
+              <w:rPr>
+                <w:b/>
+                <w:bCs/>
+                <w:color w:val="FFFFFF"/>
+                <w:sz w:val="18"/>
+                <w:szCs w:val="18"/>
+              </w:rPr>
+              <w:t xml:space="preserve">Находка</w:t>
+            </w:r>
+          </w:p>
+        </w:tc>
+        <w:tc>
+          <w:tcPr>
+            <w:tcW w:type="dxa" w:w="1500"/>
+            <w:shd w:fill="1F3864" w:color="auto" w:val="clear"/>
+            <w:tcMar>
+              <w:top w:type="dxa" w:w="40"/>
+              <w:left w:type="dxa" w:w="80"/>
+              <w:bottom w:type="dxa" w:w="40"/>
+              <w:right w:type="dxa" w:w="80"/>
+            </w:tcMar>
+          </w:tcPr>
+          <w:p>
+            <w:pPr>
+              <w:jc w:val="center"/>
+            </w:pPr>
+            <w:r>
+              <w:rPr>
+                <w:b/>
+                <w:bCs/>
+                <w:color w:val="FFFFFF"/>
+                <w:sz w:val="18"/>
+                <w:szCs w:val="18"/>
+              </w:rPr>
+              <w:t xml:space="preserve">Класс / severity</w:t>
+            </w:r>
+          </w:p>
+        </w:tc>
+        <w:tc>
+          <w:tcPr>
+            <w:tcW w:type="dxa" w:w="3700"/>
+            <w:shd w:fill="1F3864" w:color="auto" w:val="clear"/>
+            <w:tcMar>
+              <w:top w:type="dxa" w:w="40"/>
+              <w:left w:type="dxa" w:w="80"/>
+              <w:bottom w:type="dxa" w:w="40"/>
+              <w:right w:type="dxa" w:w="80"/>
+            </w:tcMar>
+          </w:tcPr>
+          <w:p>
+            <w:pPr>
+              <w:jc w:val="left"/>
+            </w:pPr>
+            <w:r>
+              <w:rPr>
+                <w:b/>
+                <w:bCs/>
+                <w:color w:val="FFFFFF"/>
+                <w:sz w:val="18"/>
+                <w:szCs w:val="18"/>
+              </w:rPr>
+              <w:t xml:space="preserve">Оценка и действие</w:t>
+            </w:r>
+          </w:p>
+        </w:tc>
+      </w:tr>
+      <w:tr>
+        <w:tc>
+          <w:tcPr>
+            <w:tcW w:type="dxa" w:w="3400"/>
+            <w:tcMar>
+              <w:top w:type="dxa" w:w="40"/>
+              <w:left w:type="dxa" w:w="80"/>
+              <w:bottom w:type="dxa" w:w="40"/>
+              <w:right w:type="dxa" w:w="80"/>
+            </w:tcMar>
+          </w:tcPr>
+          <w:p>
+            <w:pPr>
+              <w:jc w:val="left"/>
+            </w:pPr>
+            <w:r>
+              <w:rPr>
+                <w:b/>
+                <w:bCs/>
+                <w:sz w:val="22"/>
+                <w:szCs w:val="22"/>
+              </w:rPr>
+              <w:t xml:space="preserve">Внутренние IP в публичном HTML</w:t>
+            </w:r>
+          </w:p>
+        </w:tc>
+        <w:tc>
+          <w:tcPr>
+            <w:tcW w:type="dxa" w:w="1500"/>
+            <w:tcMar>
+              <w:top w:type="dxa" w:w="40"/>
+              <w:left w:type="dxa" w:w="80"/>
+              <w:bottom w:type="dxa" w:w="40"/>
+              <w:right w:type="dxa" w:w="80"/>
+            </w:tcMar>
+          </w:tcPr>
+          <w:p>
+            <w:pPr>
+              <w:jc w:val="center"/>
+            </w:pPr>
+            <w:r>
+              <w:rPr>
+                <w:b/>
+                <w:bCs/>
+                <w:color w:val="B26A00"/>
+                <w:sz w:val="18"/>
+                <w:szCs w:val="18"/>
+              </w:rPr>
+              <w:t xml:space="preserve">Info Disclosure / средняя</w:t>
+            </w:r>
+          </w:p>
+        </w:tc>
+        <w:tc>
+          <w:tcPr>
+            <w:tcW w:type="dxa" w:w="3700"/>
+            <w:tcMar>
+              <w:top w:type="dxa" w:w="40"/>
+              <w:left w:type="dxa" w:w="80"/>
+              <w:bottom w:type="dxa" w:w="40"/>
+              <w:right w:type="dxa" w:w="80"/>
+            </w:tcMar>
+          </w:tcPr>
+          <w:p>
+            <w:pPr>
+              <w:jc w:val="left"/>
+            </w:pPr>
+            <w:r>
+              <w:rPr>
+                <w:sz w:val="18"/>
+                <w:szCs w:val="18"/>
+              </w:rPr>
+              <w:t xml:space="preserve">Раскрытие топологии + причина битых ссылок. Удалить/переписать на публичные URL</w:t>
+            </w:r>
+          </w:p>
+        </w:tc>
+      </w:tr>
+      <w:tr>
+        <w:tc>
+          <w:tcPr>
+            <w:tcW w:type="dxa" w:w="3400"/>
+            <w:tcMar>
+              <w:top w:type="dxa" w:w="40"/>
+              <w:left w:type="dxa" w:w="80"/>
+              <w:bottom w:type="dxa" w:w="40"/>
+              <w:right w:type="dxa" w:w="80"/>
+            </w:tcMar>
+          </w:tcPr>
+          <w:p>
+            <w:pPr>
+              <w:jc w:val="left"/>
+            </w:pPr>
+            <w:r>
+              <w:rPr>
+                <w:b/>
+                <w:bCs/>
+                <w:sz w:val="22"/>
+                <w:szCs w:val="22"/>
+              </w:rPr>
+              <w:t xml:space="preserve">node1.rsp.gov.kz + контакт подрядчика</w:t>
+            </w:r>
+          </w:p>
+        </w:tc>
+        <w:tc>
+          <w:tcPr>
+            <w:tcW w:type="dxa" w:w="1500"/>
+            <w:tcMar>
+              <w:top w:type="dxa" w:w="40"/>
+              <w:left w:type="dxa" w:w="80"/>
+              <w:bottom w:type="dxa" w:w="40"/>
+              <w:right w:type="dxa" w:w="80"/>
+            </w:tcMar>
+          </w:tcPr>
+          <w:p>
+            <w:pPr>
+              <w:jc w:val="center"/>
+            </w:pPr>
+            <w:r>
+              <w:rPr>
+                <w:b/>
+                <w:bCs/>
+                <w:color w:val="B26A00"/>
+                <w:sz w:val="18"/>
+                <w:szCs w:val="18"/>
+              </w:rPr>
+              <w:t xml:space="preserve">Info Disclosure / низкая (CWE-200)</w:t>
+            </w:r>
+          </w:p>
+        </w:tc>
+        <w:tc>
+          <w:tcPr>
+            <w:tcW w:type="dxa" w:w="3700"/>
+            <w:tcMar>
+              <w:top w:type="dxa" w:w="40"/>
+              <w:left w:type="dxa" w:w="80"/>
+              <w:bottom w:type="dxa" w:w="40"/>
+              <w:right w:type="dxa" w:w="80"/>
+            </w:tcMar>
+          </w:tcPr>
+          <w:p>
+            <w:pPr>
+              <w:jc w:val="left"/>
+            </w:pPr>
+            <w:r>
+              <w:rPr>
+                <w:sz w:val="18"/>
+                <w:szCs w:val="18"/>
+              </w:rPr>
+              <w:t xml:space="preserve">Разведданные для атакующего. Удалить комментарий (одна строка в шаблоне)</w:t>
+            </w:r>
+          </w:p>
+        </w:tc>
+      </w:tr>
+    </w:tbl>
+    <w:p>
+      <w:pPr>
+        <w:pStyle w:val="Heading2"/>
+        <w:spacing w:after="100" w:before="220"/>
+      </w:pPr>
+      <w:r>
+        <w:t xml:space="preserve">5.2. Публичное отображение БИН/ИИН в РСП — СПОРНО, оценка ПОНИЖЕНА</w:t>
+      </w:r>
+    </w:p>
+    <w:p>
+      <w:pPr>
+        <w:spacing w:after="120" w:line="276"/>
+      </w:pPr>
+      <w:r>
+        <w:rPr>
+          <w:b/>
+          <w:bCs/>
+          <w:sz w:val="22"/>
+          <w:szCs w:val="22"/>
+        </w:rPr>
+        <w:t xml:space="preserve">Факт. </w:t>
+      </w:r>
+      <w:r>
+        <w:rPr>
+          <w:sz w:val="22"/>
+          <w:szCs w:val="22"/>
+        </w:rPr>
+        <w:t xml:space="preserve">Раздел /ru/rsp (Реестр субъектов предпринимательства) без авторизации отдаёт таблицу с колонкой «БИН/ИИН». На глубоких страницах (проверены стр. 40000, 70000, 100000, 110000, 114000) большинство строк — индивидуальные предприниматели с полным ИИН + ФИО. Реестр перечисляем через ?page=N (≈ 114 000 страниц), рендерится на сервере (0 XHR).</w:t>
+      </w:r>
+    </w:p>
+    <w:p>
+      <w:pPr>
+        <w:spacing w:after="120" w:line="276"/>
+      </w:pPr>
+      <w:r>
+        <w:rPr>
+          <w:b/>
+          <w:bCs/>
+          <w:sz w:val="22"/>
+          <w:szCs w:val="22"/>
+        </w:rPr>
+        <w:t xml:space="preserve">Калибровка (важно). </w:t>
+      </w:r>
+      <w:r>
+        <w:rPr>
+          <w:sz w:val="22"/>
+          <w:szCs w:val="22"/>
+        </w:rPr>
+        <w:t xml:space="preserve">Классифицировать это как «утечку ПДн» или уязвимость портала было бы преувеличением. Обоснование:</w:t>
+      </w:r>
+    </w:p>
+    <w:p>
+      <w:pPr>
+        <w:pStyle w:val="ListParagraph"/>
+        <w:numPr>
+          <w:ilvl w:val="0"/>
+          <w:numId w:val="2"/>
+        </w:numPr>
+        <w:spacing w:after="60"/>
+      </w:pPr>
+      <w:r>
+        <w:rPr>
+          <w:sz w:val="22"/>
+          <w:szCs w:val="22"/>
+        </w:rPr>
+        <w:t xml:space="preserve">БИН юридических лиц — публичный идентификатор (счета, договоры, открытые данные stat.gov.kz / kgd.gov.kz).</w:t>
+      </w:r>
+    </w:p>
+    <w:p>
+      <w:pPr>
+        <w:pStyle w:val="ListParagraph"/>
+        <w:numPr>
+          <w:ilvl w:val="0"/>
+          <w:numId w:val="2"/>
+        </w:numPr>
+        <w:spacing w:after="60"/>
+      </w:pPr>
+      <w:r>
+        <w:rPr>
+          <w:sz w:val="22"/>
+          <w:szCs w:val="22"/>
+        </w:rPr>
+        <w:t xml:space="preserve">ИИН индивидуального предпринимателя выступает его предпринимательским идентификатором и уже фигурирует публично; РСП — государственный реестр, задуманный как общедоступный, то есть раскрытие идентификатора предусмотрено его назначением.</w:t>
+      </w:r>
+    </w:p>
+    <w:p>
+      <w:pPr>
+        <w:pStyle w:val="ListParagraph"/>
+        <w:numPr>
+          <w:ilvl w:val="0"/>
+          <w:numId w:val="2"/>
+        </w:numPr>
+        <w:spacing w:after="60"/>
+      </w:pPr>
+      <w:r>
+        <w:rPr>
+          <w:sz w:val="22"/>
+          <w:szCs w:val="22"/>
+        </w:rPr>
+        <w:t xml:space="preserve">В таблице нет данных сверх реестрового минимума: нет адресов, телефонов, сканов документов (колонки: БИН/ИИН, наименование/ФИО, ОКЭД, число сотрудников, категория).</w:t>
+      </w:r>
+    </w:p>
+    <w:p>
+      <w:pPr>
+        <w:spacing w:after="120" w:line="276"/>
+      </w:pPr>
+      <w:r>
+        <w:rPr>
+          <w:b/>
+          <w:bCs/>
+          <w:sz w:val="22"/>
+          <w:szCs w:val="22"/>
+        </w:rPr>
+        <w:t xml:space="preserve">Остаточный нюанс (уровень рекомендации, НЕ дефект). </w:t>
+      </w:r>
+      <w:r>
+        <w:rPr>
+          <w:sz w:val="22"/>
+          <w:szCs w:val="22"/>
+        </w:rPr>
+        <w:t xml:space="preserve">Единственное защищаемое замечание — массовая перечисляемость PII-содержащего датасета без anti-scraping/rate-limit: весь массив «ИИН + ФИО + вид деятельности» тривиально выкачивается ботом (риск агрегации), а ИИН по структуре кодирует дату рождения. Рекомендация — ограничить пакетную выгрузку. Но если реестр законодательно обязан быть полностью открытым, это вопрос политики данных, а не ИБ-дефект.</w:t>
+      </w:r>
+    </w:p>
+    <w:p>
+      <w:pPr>
+        <w:pBdr>
+          <w:top w:val="single" w:color="E0C060" w:sz="4"/>
+          <w:bottom w:val="single" w:color="E0C060" w:sz="4"/>
+          <w:left w:val="single" w:color="E0C060" w:sz="4"/>
+          <w:right w:val="single" w:color="E0C060" w:sz="4"/>
+        </w:pBdr>
+        <w:shd w:fill="FFF3CD" w:color="auto" w:val="clear"/>
+        <w:spacing w:after="120"/>
+      </w:pPr>
+      <w:r>
+        <w:rPr>
+          <w:i/>
+          <w:iCs/>
+          <w:sz w:val="20"/>
+          <w:szCs w:val="20"/>
+        </w:rPr>
+        <w:t xml:space="preserve">Оговорка о калибровке: в предварительной оценке этот пункт ошибочно был обозначен как «утечка персональных данных высокой важности». После проверки назначения реестра (общедоступный госреестр) оценка понижена до наблюдения по data-governance (перечисляемость), без статуса уязвимости.</w:t>
+      </w:r>
+    </w:p>
+    <w:p>
+      <w:pPr>
         <w:spacing w:after="60" w:before="120"/>
         <w:jc w:val="center"/>
       </w:pPr>
       <w:r>
         <w:drawing>
           <wp:inline distT="0" distB="0" distL="0" distR="0">
-            <wp:extent cx="5905500" cy="3895725"/>
+            <wp:extent cx="5905500" cy="4514850"/>
             <wp:effectExtent t="0" r="0" b="0" l="0"/>
             <wp:docPr id="1" name="" descr="" title=""/>
             <wp:cNvGraphicFramePr>
@@ -3415,7 +4056,7 @@
                   <pic:spPr bwMode="auto">
                     <a:xfrm>
                       <a:off x="0" y="0"/>
-                      <a:ext cx="5905500" cy="3895725"/>
+                      <a:ext cx="5905500" cy="4514850"/>
                     </a:xfrm>
                     <a:prstGeom prst="rect">
                       <a:avLst/>
@@ -3441,58 +4082,7 @@
           <w:sz w:val="18"/>
           <w:szCs w:val="18"/>
         </w:rPr>
-        <w:t xml:space="preserve">Скриншот 4. Битая self-ссылка (утерян префикс https://) → HTTP 404.</w:t>
-      </w:r>
-    </w:p>
-    <w:p>
-      <w:pPr>
-        <w:spacing w:after="120" w:line="276"/>
-      </w:pPr>
-      <w:r>
-        <w:rPr>
-          <w:b/>
-          <w:bCs/>
-          <w:sz w:val="22"/>
-          <w:szCs w:val="22"/>
-        </w:rPr>
-        <w:t xml:space="preserve">Природа внутренних адресов. </w:t>
-      </w:r>
-      <w:r>
-        <w:rPr>
-          <w:sz w:val="22"/>
-          <w:szCs w:val="22"/>
-        </w:rPr>
-        <w:t xml:space="preserve">10.61.42.188 и 10.61.41.253 — частные адреса ведомственной сети, недостижимые для любого пользователя вне государственного интранета. Со стороны среды аудита обращение блокируется с явной причиной private_dest_ip (HTTP 403), что подтверждает их приватную природу.</w:t>
-      </w:r>
-    </w:p>
-    <w:p>
-      <w:pPr>
-        <w:pStyle w:val="Heading2"/>
-        <w:spacing w:after="100" w:before="220"/>
-      </w:pPr>
-      <w:r>
-        <w:t xml:space="preserve">4.3. Содержимое: хранит ли реестр сами требования?</w:t>
-      </w:r>
-    </w:p>
-    <w:p>
-      <w:pPr>
-        <w:spacing w:after="120" w:line="276"/>
-      </w:pPr>
-      <w:r>
-        <w:rPr>
-          <w:b/>
-          <w:bCs/>
-          <w:sz w:val="22"/>
-          <w:szCs w:val="22"/>
-        </w:rPr>
-        <w:t xml:space="preserve">Нет. </w:t>
-      </w:r>
-      <w:r>
-        <w:rPr>
-          <w:sz w:val="22"/>
-          <w:szCs w:val="22"/>
-        </w:rPr>
-        <w:t xml:space="preserve">Реестр не содержит текста обязательных требований и выступает указателем (каталогом) ссылок: наименование акта → внешняя ссылка. При этом 87,7 % ссылок ведут на недоступные извне адреса; 12,2 % дублируют публичный adilet.zan.kz; добавленной ценности карточка не даёт.</w:t>
+        <w:t xml:space="preserve">Скриншот 4. РСП /ru/rsp, глубокая страница: строки индивидуальных предпринимателей (ИИН замаскированы для отчёта). Данные публичны и без авторизации, но соответствуют назначению общедоступного реестра.</w:t>
       </w:r>
     </w:p>
     <w:p>
@@ -3506,7 +4096,7 @@
         <w:spacing w:after="120" w:before="280"/>
       </w:pPr>
       <w:r>
-        <w:t xml:space="preserve">5. Таблица проверенных документов (25 из 80)</w:t>
+        <w:t xml:space="preserve">6. Таблица проверенных документов (25 из 80)</w:t>
       </w:r>
     </w:p>
     <w:p>
@@ -6615,7 +7205,7 @@
           <w:sz w:val="22"/>
           <w:szCs w:val="22"/>
         </w:rPr>
-        <w:t xml:space="preserve">Все 25 документов имеют статус «Действующий». Поисковыми запросами дополнительно подтверждено наличие подзаконных актов: приказы — 1 773, постановления — 97, указы — 8; их ссылки ведут преимущественно на тот же 10.61.42.188.</w:t>
+        <w:t xml:space="preserve">Все 25 документов имеют статус «Действующий». Дополнительно подтверждено наличие подзаконных актов: приказы — 1 773, постановления — 97, указы — 8 (ссылки ведут преимущественно на тот же 10.61.42.188).</w:t>
       </w:r>
     </w:p>
     <w:p>
@@ -6624,7 +7214,7 @@
         <w:spacing w:after="120" w:before="280"/>
       </w:pPr>
       <w:r>
-        <w:t xml:space="preserve">6. Таблица ошибок</w:t>
+        <w:t xml:space="preserve">7. Таблица ошибок</w:t>
       </w:r>
     </w:p>
     <w:tbl>
@@ -7271,7 +7861,7 @@
                 <w:sz w:val="18"/>
                 <w:szCs w:val="18"/>
               </w:rPr>
-              <w:t xml:space="preserve">Раскрытие внутренней инфраструктуры</w:t>
+              <w:t xml:space="preserve">Раскрытие внутр. инфраструктуры</w:t>
             </w:r>
           </w:p>
         </w:tc>
@@ -7294,7 +7884,7 @@
                 <w:sz w:val="18"/>
                 <w:szCs w:val="18"/>
               </w:rPr>
-              <w:t xml:space="preserve">Приватные IP в публичном HTML</w:t>
+              <w:t xml:space="preserve">Приватные IP + node1.rsp.gov.kz в публичном HTML</w:t>
             </w:r>
           </w:p>
         </w:tc>
@@ -7317,7 +7907,7 @@
                 <w:sz w:val="18"/>
                 <w:szCs w:val="18"/>
               </w:rPr>
-              <w:t xml:space="preserve">Утечка топологии сети</w:t>
+              <w:t xml:space="preserve">Утечка топологии (см. раздел 5)</w:t>
             </w:r>
           </w:p>
         </w:tc>
@@ -7332,7 +7922,7 @@
           <w:sz w:val="22"/>
           <w:szCs w:val="22"/>
         </w:rPr>
-        <w:t xml:space="preserve">Циклических редиректов не обнаружено. Ссылки на localhost не обнаружены. Основной класс — недостижимые внутренние адреса и отсутствие содержимого.</w:t>
+        <w:t xml:space="preserve">Циклических редиректов и ссылок на localhost не обнаружено. Основной класс — недостижимые внутренние адреса и отсутствие содержимого.</w:t>
       </w:r>
     </w:p>
     <w:p>
@@ -7341,7 +7931,7 @@
         <w:spacing w:after="120" w:before="280"/>
       </w:pPr>
       <w:r>
-        <w:t xml:space="preserve">7. Перечень редиректов</w:t>
+        <w:t xml:space="preserve">8. Перечень редиректов</w:t>
       </w:r>
     </w:p>
     <w:tbl>
@@ -7809,7 +8399,7 @@
         <w:spacing w:after="120" w:before="280"/>
       </w:pPr>
       <w:r>
-        <w:t xml:space="preserve">8. Сетевой анализ (Network)</w:t>
+        <w:t xml:space="preserve">9. Сетевой анализ (Network)</w:t>
       </w:r>
     </w:p>
     <w:p>
@@ -7826,7 +8416,7 @@
           <w:sz w:val="22"/>
           <w:szCs w:val="22"/>
         </w:rPr>
-        <w:t xml:space="preserve">При открытии главной и раскрытии карточек XHR/fetch-запросов — 0. Данные полностью встроены в HTML при серверном рендеринге.</w:t>
+        <w:t xml:space="preserve">При открытии главной и раскрытии карточек XHR/fetch-запросов — 0. Данные полностью встроены в HTML (SSR).</w:t>
       </w:r>
     </w:p>
     <w:p>
@@ -7843,7 +8433,7 @@
           <w:sz w:val="22"/>
           <w:szCs w:val="22"/>
         </w:rPr>
-        <w:t xml:space="preserve">Внешние хосты при загрузке страницы: rsp.gov.kz (свой), fonts.googleapis.com, fonts.gstatic.com (Google Fonts). Иных сторонних сервисов не зафиксировано.</w:t>
+        <w:t xml:space="preserve">Внешние хосты при загрузке: rsp.gov.kz (свой), fonts.googleapis.com, fonts.gstatic.com. Иных сторонних сервисов нет.</w:t>
       </w:r>
     </w:p>
     <w:p>
@@ -7877,7 +8467,7 @@
           <w:sz w:val="22"/>
           <w:szCs w:val="22"/>
         </w:rPr>
-        <w:t xml:space="preserve">Признаков публичного API (REST/GraphQL/JSON) не обнаружено — интеграция и выгрузка данных внешними потребителями невозможны.</w:t>
+        <w:t xml:space="preserve">Публичного API (REST/GraphQL/JSON) не обнаружено — интеграция/выгрузка внешними потребителями невозможны.</w:t>
       </w:r>
     </w:p>
     <w:p>
@@ -7953,16 +8543,7 @@
         <w:spacing w:after="120" w:before="280"/>
       </w:pPr>
       <w:r>
-        <w:t xml:space="preserve">9. Соответствие назначению и архитектурный аудит</w:t>
-      </w:r>
-    </w:p>
-    <w:p>
-      <w:pPr>
-        <w:pStyle w:val="Heading2"/>
-        <w:spacing w:after="100" w:before="220"/>
-      </w:pPr>
-      <w:r>
-        <w:t xml:space="preserve">9.1. Возможности, ожидаемые от Реестра обязательных требований</w:t>
+        <w:t xml:space="preserve">10. Соответствие назначению и архитектурный аудит</w:t>
       </w:r>
     </w:p>
     <w:tbl>
@@ -8108,6 +8689,9 @@
             </w:pPr>
             <w:r>
               <w:rPr>
+                <w:b/>
+                <w:bCs/>
+                <w:color w:val="C00000"/>
                 <w:sz w:val="18"/>
                 <w:szCs w:val="18"/>
               </w:rPr>
@@ -8179,6 +8763,9 @@
             </w:pPr>
             <w:r>
               <w:rPr>
+                <w:b/>
+                <w:bCs/>
+                <w:color w:val="B26A00"/>
                 <w:sz w:val="18"/>
                 <w:szCs w:val="18"/>
               </w:rPr>
@@ -8250,6 +8837,9 @@
             </w:pPr>
             <w:r>
               <w:rPr>
+                <w:b/>
+                <w:bCs/>
+                <w:color w:val="B26A00"/>
                 <w:sz w:val="18"/>
                 <w:szCs w:val="18"/>
               </w:rPr>
@@ -8321,6 +8911,9 @@
             </w:pPr>
             <w:r>
               <w:rPr>
+                <w:b/>
+                <w:bCs/>
+                <w:color w:val="C00000"/>
                 <w:sz w:val="18"/>
                 <w:szCs w:val="18"/>
               </w:rPr>
@@ -8392,6 +8985,9 @@
             </w:pPr>
             <w:r>
               <w:rPr>
+                <w:b/>
+                <w:bCs/>
+                <w:color w:val="C00000"/>
                 <w:sz w:val="18"/>
                 <w:szCs w:val="18"/>
               </w:rPr>
@@ -8418,7 +9014,7 @@
                 <w:sz w:val="18"/>
                 <w:szCs w:val="18"/>
               </w:rPr>
-              <w:t xml:space="preserve">Привязки к конкретному требованию нет</w:t>
+              <w:t xml:space="preserve">Привязки к требованию нет</w:t>
             </w:r>
           </w:p>
         </w:tc>
@@ -8463,6 +9059,9 @@
             </w:pPr>
             <w:r>
               <w:rPr>
+                <w:b/>
+                <w:bCs/>
+                <w:color w:val="C00000"/>
                 <w:sz w:val="18"/>
                 <w:szCs w:val="18"/>
               </w:rPr>
@@ -8534,6 +9133,9 @@
             </w:pPr>
             <w:r>
               <w:rPr>
+                <w:b/>
+                <w:bCs/>
+                <w:color w:val="C00000"/>
                 <w:sz w:val="18"/>
                 <w:szCs w:val="18"/>
               </w:rPr>
@@ -8605,6 +9207,9 @@
             </w:pPr>
             <w:r>
               <w:rPr>
+                <w:b/>
+                <w:bCs/>
+                <w:color w:val="C00000"/>
                 <w:sz w:val="18"/>
                 <w:szCs w:val="18"/>
               </w:rPr>
@@ -8643,7 +9248,7 @@
         <w:spacing w:after="100" w:before="220"/>
       </w:pPr>
       <w:r>
-        <w:t xml:space="preserve">9.2. Архитектурные выводы</w:t>
+        <w:t xml:space="preserve">Архитектурные выводы</w:t>
       </w:r>
     </w:p>
     <w:p>
@@ -8669,7 +9274,7 @@
           <w:sz w:val="22"/>
           <w:szCs w:val="22"/>
         </w:rPr>
-        <w:t xml:space="preserve">тексты требований в системе не хранятся; реестр — это индекс ссылок.</w:t>
+        <w:t xml:space="preserve">тексты требований не хранятся; реестр — индекс ссылок.</w:t>
       </w:r>
     </w:p>
     <w:p>
@@ -8688,14 +9293,14 @@
           <w:sz w:val="22"/>
           <w:szCs w:val="22"/>
         </w:rPr>
-        <w:t xml:space="preserve">Reverse proxy / переписывание ссылок: </w:t>
+        <w:t xml:space="preserve">Reverse proxy / нормализация ссылок: </w:t>
       </w:r>
       <w:r>
         <w:rPr>
           <w:sz w:val="22"/>
           <w:szCs w:val="22"/>
         </w:rPr>
-        <w:t xml:space="preserve">отсутствует нормализация — внутренние адреса 10.61.x.x попадают в публичный HTML «как есть».</w:t>
+        <w:t xml:space="preserve">отсутствует — внутренние адреса 10.61.x.x попадают в публичный HTML «как есть».</w:t>
       </w:r>
     </w:p>
     <w:p>
@@ -8714,14 +9319,14 @@
           <w:sz w:val="22"/>
           <w:szCs w:val="22"/>
         </w:rPr>
-        <w:t xml:space="preserve">Признаки незавершённости / тестовой инфраструктуры: </w:t>
+        <w:t xml:space="preserve">Признаки незавершённости/тестовой инфраструктуры: </w:t>
       </w:r>
       <w:r>
         <w:rPr>
           <w:sz w:val="22"/>
           <w:szCs w:val="22"/>
         </w:rPr>
-        <w:t xml:space="preserve">налицо. Наиболее вероятные причины — ошибочная публикация внутренних данных в открытый контур; незавершённая настройка reverse proxy; остатки тестового окружения (жёстко зашитые IP); разнородность источников (два внутренних узла + adilet) без унификации.</w:t>
+        <w:t xml:space="preserve">налицо — ошибочная публикация внутренних данных, незавершённая настройка proxy, разнородные источники (два внутренних узла + adilet) без унификации.</w:t>
       </w:r>
     </w:p>
     <w:p>
@@ -8730,7 +9335,7 @@
         <w:spacing w:after="120" w:before="280"/>
       </w:pPr>
       <w:r>
-        <w:t xml:space="preserve">10. UX-аудит (глазами пользователя)</w:t>
+        <w:t xml:space="preserve">11. UX-аудит (глазами пользователя)</w:t>
       </w:r>
     </w:p>
     <w:tbl>
@@ -8899,7 +9504,7 @@
                 <w:sz w:val="18"/>
                 <w:szCs w:val="18"/>
               </w:rPr>
-              <w:t xml:space="preserve">Частично: раскрывается таблица с почти пустыми полями и ссылкой.</w:t>
+              <w:t xml:space="preserve">Частично: таблица с почти пустыми полями и ссылкой.</w:t>
             </w:r>
           </w:p>
         </w:tc>
@@ -8972,7 +9577,7 @@
                 <w:sz w:val="18"/>
                 <w:szCs w:val="18"/>
               </w:rPr>
-              <w:t xml:space="preserve">Есть ли ценность против прямого поиска в Әділет?</w:t>
+              <w:t xml:space="preserve">Ценность против прямого поиска в Әділет?</w:t>
             </w:r>
           </w:p>
         </w:tc>
@@ -9007,7 +9612,7 @@
         <w:spacing w:after="120" w:before="280"/>
       </w:pPr>
       <w:r>
-        <w:t xml:space="preserve">11. Реестр или каталог ссылок?</w:t>
+        <w:t xml:space="preserve">12. Реестр или каталог ссылок?</w:t>
       </w:r>
     </w:p>
     <w:p>
@@ -9021,7 +9626,7 @@
           <w:sz w:val="22"/>
           <w:szCs w:val="22"/>
         </w:rPr>
-        <w:t xml:space="preserve">Вывод: в части «Регуляторные акты» текущая реализация является каталогом (индексом) ссылок на внешние нормативные документы, а не полноценным Реестром обязательных требований.</w:t>
+        <w:t xml:space="preserve">Вывод: в части «Регуляторные акты» реализация является каталогом (индексом) ссылок на внешние нормативные документы, а не полноценным Реестром обязательных требований.</w:t>
       </w:r>
     </w:p>
     <w:p>
@@ -9038,7 +9643,7 @@
           <w:sz w:val="22"/>
           <w:szCs w:val="22"/>
         </w:rPr>
-        <w:t xml:space="preserve">Сам текст обязательного требования в системе не хранится.</w:t>
+        <w:t xml:space="preserve">Текст обязательного требования в системе не хранится.</w:t>
       </w:r>
     </w:p>
     <w:p>
@@ -9072,7 +9677,7 @@
           <w:sz w:val="22"/>
           <w:szCs w:val="22"/>
         </w:rPr>
-        <w:t xml:space="preserve">Ключевые атрибуты требования (орган, связь с проверками, история, редакции, ОКЭД, досье) не заполнены.</w:t>
+        <w:t xml:space="preserve">Ключевые атрибуты (орган, связь с проверками, история, редакции, ОКЭД, досье) не заполнены.</w:t>
       </w:r>
     </w:p>
     <w:p>
@@ -9103,7 +9708,1231 @@
         <w:spacing w:after="120" w:before="280"/>
       </w:pPr>
       <w:r>
-        <w:t xml:space="preserve">12. Итоговая экспертная оценка (10-балльная шкала)</w:t>
+        <w:t xml:space="preserve">13. Сравнение с независимыми заключениями (Gemini, Qwen)</w:t>
+      </w:r>
+    </w:p>
+    <w:p>
+      <w:pPr>
+        <w:spacing w:after="120" w:line="276"/>
+      </w:pPr>
+      <w:r>
+        <w:rPr>
+          <w:sz w:val="22"/>
+          <w:szCs w:val="22"/>
+        </w:rPr>
+        <w:t xml:space="preserve">Ниже — сопоставление трёх независимых заключений с фактическими наблюдениями данного аудита. Все три сходятся в главном (портал — каталог ссылок; масса ссылок ведёт на внутренние IP; назначению не соответствует), но существенно различаются по фактической точности и глубине.</w:t>
+      </w:r>
+    </w:p>
+    <w:tbl>
+      <w:tblPr>
+        <w:tblW w:type="dxa" w:w="8600"/>
+        <w:tblBorders>
+          <w:top w:val="single" w:color="BBBBBB" w:sz="4"/>
+          <w:left w:val="single" w:color="BBBBBB" w:sz="4"/>
+          <w:bottom w:val="single" w:color="BBBBBB" w:sz="4"/>
+          <w:right w:val="single" w:color="BBBBBB" w:sz="4"/>
+          <w:insideH w:val="single" w:color="BBBBBB" w:sz="4"/>
+          <w:insideV w:val="single" w:color="BBBBBB" w:sz="4"/>
+        </w:tblBorders>
+      </w:tblPr>
+      <w:tblGrid>
+        <w:gridCol w:w="2200"/>
+        <w:gridCol w:w="2200"/>
+        <w:gridCol w:w="2000"/>
+        <w:gridCol w:w="2200"/>
+      </w:tblGrid>
+      <w:tr>
+        <w:trPr>
+          <w:tblHeader/>
+        </w:trPr>
+        <w:tc>
+          <w:tcPr>
+            <w:tcW w:type="dxa" w:w="2200"/>
+            <w:shd w:fill="1F3864" w:color="auto" w:val="clear"/>
+            <w:tcMar>
+              <w:top w:type="dxa" w:w="40"/>
+              <w:left w:type="dxa" w:w="80"/>
+              <w:bottom w:type="dxa" w:w="40"/>
+              <w:right w:type="dxa" w:w="80"/>
+            </w:tcMar>
+          </w:tcPr>
+          <w:p>
+            <w:pPr>
+              <w:jc w:val="left"/>
+            </w:pPr>
+            <w:r>
+              <w:rPr>
+                <w:b/>
+                <w:bCs/>
+                <w:color w:val="FFFFFF"/>
+                <w:sz w:val="18"/>
+                <w:szCs w:val="18"/>
+              </w:rPr>
+              <w:t xml:space="preserve">Аспект</w:t>
+            </w:r>
+          </w:p>
+        </w:tc>
+        <w:tc>
+          <w:tcPr>
+            <w:tcW w:type="dxa" w:w="2200"/>
+            <w:shd w:fill="1F3864" w:color="auto" w:val="clear"/>
+            <w:tcMar>
+              <w:top w:type="dxa" w:w="40"/>
+              <w:left w:type="dxa" w:w="80"/>
+              <w:bottom w:type="dxa" w:w="40"/>
+              <w:right w:type="dxa" w:w="80"/>
+            </w:tcMar>
+          </w:tcPr>
+          <w:p>
+            <w:pPr>
+              <w:jc w:val="left"/>
+            </w:pPr>
+            <w:r>
+              <w:rPr>
+                <w:b/>
+                <w:bCs/>
+                <w:color w:val="FFFFFF"/>
+                <w:sz w:val="18"/>
+                <w:szCs w:val="18"/>
+              </w:rPr>
+              <w:t xml:space="preserve">Gemini</w:t>
+            </w:r>
+          </w:p>
+        </w:tc>
+        <w:tc>
+          <w:tcPr>
+            <w:tcW w:type="dxa" w:w="2000"/>
+            <w:shd w:fill="1F3864" w:color="auto" w:val="clear"/>
+            <w:tcMar>
+              <w:top w:type="dxa" w:w="40"/>
+              <w:left w:type="dxa" w:w="80"/>
+              <w:bottom w:type="dxa" w:w="40"/>
+              <w:right w:type="dxa" w:w="80"/>
+            </w:tcMar>
+          </w:tcPr>
+          <w:p>
+            <w:pPr>
+              <w:jc w:val="left"/>
+            </w:pPr>
+            <w:r>
+              <w:rPr>
+                <w:b/>
+                <w:bCs/>
+                <w:color w:val="FFFFFF"/>
+                <w:sz w:val="18"/>
+                <w:szCs w:val="18"/>
+              </w:rPr>
+              <w:t xml:space="preserve">Qwen</w:t>
+            </w:r>
+          </w:p>
+        </w:tc>
+        <w:tc>
+          <w:tcPr>
+            <w:tcW w:type="dxa" w:w="2200"/>
+            <w:shd w:fill="1F3864" w:color="auto" w:val="clear"/>
+            <w:tcMar>
+              <w:top w:type="dxa" w:w="40"/>
+              <w:left w:type="dxa" w:w="80"/>
+              <w:bottom w:type="dxa" w:w="40"/>
+              <w:right w:type="dxa" w:w="80"/>
+            </w:tcMar>
+          </w:tcPr>
+          <w:p>
+            <w:pPr>
+              <w:jc w:val="left"/>
+            </w:pPr>
+            <w:r>
+              <w:rPr>
+                <w:b/>
+                <w:bCs/>
+                <w:color w:val="FFFFFF"/>
+                <w:sz w:val="18"/>
+                <w:szCs w:val="18"/>
+              </w:rPr>
+              <w:t xml:space="preserve">Факт (данный аудит)</w:t>
+            </w:r>
+          </w:p>
+        </w:tc>
+      </w:tr>
+      <w:tr>
+        <w:tc>
+          <w:tcPr>
+            <w:tcW w:type="dxa" w:w="2200"/>
+            <w:tcMar>
+              <w:top w:type="dxa" w:w="40"/>
+              <w:left w:type="dxa" w:w="80"/>
+              <w:bottom w:type="dxa" w:w="40"/>
+              <w:right w:type="dxa" w:w="80"/>
+            </w:tcMar>
+          </w:tcPr>
+          <w:p>
+            <w:pPr>
+              <w:jc w:val="left"/>
+            </w:pPr>
+            <w:r>
+              <w:rPr>
+                <w:sz w:val="18"/>
+                <w:szCs w:val="18"/>
+              </w:rPr>
+              <w:t xml:space="preserve">Архитектура</w:t>
+            </w:r>
+          </w:p>
+        </w:tc>
+        <w:tc>
+          <w:tcPr>
+            <w:tcW w:type="dxa" w:w="2200"/>
+            <w:tcMar>
+              <w:top w:type="dxa" w:w="40"/>
+              <w:left w:type="dxa" w:w="80"/>
+              <w:bottom w:type="dxa" w:w="40"/>
+              <w:right w:type="dxa" w:w="80"/>
+            </w:tcMar>
+          </w:tcPr>
+          <w:p>
+            <w:pPr>
+              <w:jc w:val="left"/>
+            </w:pPr>
+            <w:r>
+              <w:rPr>
+                <w:b/>
+                <w:bCs/>
+                <w:color w:val="C00000"/>
+                <w:sz w:val="18"/>
+                <w:szCs w:val="18"/>
+              </w:rPr>
+              <w:t xml:space="preserve">SPA (Vue/React)+API</w:t>
+            </w:r>
+          </w:p>
+        </w:tc>
+        <w:tc>
+          <w:tcPr>
+            <w:tcW w:type="dxa" w:w="2000"/>
+            <w:tcMar>
+              <w:top w:type="dxa" w:w="40"/>
+              <w:left w:type="dxa" w:w="80"/>
+              <w:bottom w:type="dxa" w:w="40"/>
+              <w:right w:type="dxa" w:w="80"/>
+            </w:tcMar>
+          </w:tcPr>
+          <w:p>
+            <w:pPr>
+              <w:jc w:val="left"/>
+            </w:pPr>
+            <w:r>
+              <w:rPr>
+                <w:sz w:val="18"/>
+                <w:szCs w:val="18"/>
+              </w:rPr>
+              <w:t xml:space="preserve">—</w:t>
+            </w:r>
+          </w:p>
+        </w:tc>
+        <w:tc>
+          <w:tcPr>
+            <w:tcW w:type="dxa" w:w="2200"/>
+            <w:tcMar>
+              <w:top w:type="dxa" w:w="40"/>
+              <w:left w:type="dxa" w:w="80"/>
+              <w:bottom w:type="dxa" w:w="40"/>
+              <w:right w:type="dxa" w:w="80"/>
+            </w:tcMar>
+          </w:tcPr>
+          <w:p>
+            <w:pPr>
+              <w:jc w:val="left"/>
+            </w:pPr>
+            <w:r>
+              <w:rPr>
+                <w:b/>
+                <w:bCs/>
+                <w:color w:val="2E7D32"/>
+                <w:sz w:val="18"/>
+                <w:szCs w:val="18"/>
+              </w:rPr>
+              <w:t xml:space="preserve">SSR Laravel+jQuery, 0 XHR</w:t>
+            </w:r>
+          </w:p>
+        </w:tc>
+      </w:tr>
+      <w:tr>
+        <w:tc>
+          <w:tcPr>
+            <w:tcW w:type="dxa" w:w="2200"/>
+            <w:tcMar>
+              <w:top w:type="dxa" w:w="40"/>
+              <w:left w:type="dxa" w:w="80"/>
+              <w:bottom w:type="dxa" w:w="40"/>
+              <w:right w:type="dxa" w:w="80"/>
+            </w:tcMar>
+          </w:tcPr>
+          <w:p>
+            <w:pPr>
+              <w:jc w:val="left"/>
+            </w:pPr>
+            <w:r>
+              <w:rPr>
+                <w:sz w:val="18"/>
+                <w:szCs w:val="18"/>
+              </w:rPr>
+              <w:t xml:space="preserve">Внутренние IP</w:t>
+            </w:r>
+          </w:p>
+        </w:tc>
+        <w:tc>
+          <w:tcPr>
+            <w:tcW w:type="dxa" w:w="2200"/>
+            <w:tcMar>
+              <w:top w:type="dxa" w:w="40"/>
+              <w:left w:type="dxa" w:w="80"/>
+              <w:bottom w:type="dxa" w:w="40"/>
+              <w:right w:type="dxa" w:w="80"/>
+            </w:tcMar>
+          </w:tcPr>
+          <w:p>
+            <w:pPr>
+              <w:jc w:val="left"/>
+            </w:pPr>
+            <w:r>
+              <w:rPr>
+                <w:b/>
+                <w:bCs/>
+                <w:color w:val="B26A00"/>
+                <w:sz w:val="18"/>
+                <w:szCs w:val="18"/>
+              </w:rPr>
+              <w:t xml:space="preserve">10.x + 192.168.x (плейсхолдеры)</w:t>
+            </w:r>
+          </w:p>
+        </w:tc>
+        <w:tc>
+          <w:tcPr>
+            <w:tcW w:type="dxa" w:w="2000"/>
+            <w:tcMar>
+              <w:top w:type="dxa" w:w="40"/>
+              <w:left w:type="dxa" w:w="80"/>
+              <w:bottom w:type="dxa" w:w="40"/>
+              <w:right w:type="dxa" w:w="80"/>
+            </w:tcMar>
+          </w:tcPr>
+          <w:p>
+            <w:pPr>
+              <w:jc w:val="left"/>
+            </w:pPr>
+            <w:r>
+              <w:rPr>
+                <w:sz w:val="18"/>
+                <w:szCs w:val="18"/>
+              </w:rPr>
+              <w:t xml:space="preserve">10.61.42.188 / .253; 72,6 %</w:t>
+            </w:r>
+          </w:p>
+        </w:tc>
+        <w:tc>
+          <w:tcPr>
+            <w:tcW w:type="dxa" w:w="2200"/>
+            <w:tcMar>
+              <w:top w:type="dxa" w:w="40"/>
+              <w:left w:type="dxa" w:w="80"/>
+              <w:bottom w:type="dxa" w:w="40"/>
+              <w:right w:type="dxa" w:w="80"/>
+            </w:tcMar>
+          </w:tcPr>
+          <w:p>
+            <w:pPr>
+              <w:jc w:val="left"/>
+            </w:pPr>
+            <w:r>
+              <w:rPr>
+                <w:b/>
+                <w:bCs/>
+                <w:color w:val="2E7D32"/>
+                <w:sz w:val="18"/>
+                <w:szCs w:val="18"/>
+              </w:rPr>
+              <w:t xml:space="preserve">10.61.42.188 + 10.61.41.253</w:t>
+            </w:r>
+          </w:p>
+        </w:tc>
+      </w:tr>
+      <w:tr>
+        <w:tc>
+          <w:tcPr>
+            <w:tcW w:type="dxa" w:w="2200"/>
+            <w:tcMar>
+              <w:top w:type="dxa" w:w="40"/>
+              <w:left w:type="dxa" w:w="80"/>
+              <w:bottom w:type="dxa" w:w="40"/>
+              <w:right w:type="dxa" w:w="80"/>
+            </w:tcMar>
+          </w:tcPr>
+          <w:p>
+            <w:pPr>
+              <w:jc w:val="left"/>
+            </w:pPr>
+            <w:r>
+              <w:rPr>
+                <w:sz w:val="18"/>
+                <w:szCs w:val="18"/>
+              </w:rPr>
+              <w:t xml:space="preserve">Протокол/ошибка</w:t>
+            </w:r>
+          </w:p>
+        </w:tc>
+        <w:tc>
+          <w:tcPr>
+            <w:tcW w:type="dxa" w:w="2200"/>
+            <w:tcMar>
+              <w:top w:type="dxa" w:w="40"/>
+              <w:left w:type="dxa" w:w="80"/>
+              <w:bottom w:type="dxa" w:w="40"/>
+              <w:right w:type="dxa" w:w="80"/>
+            </w:tcMar>
+          </w:tcPr>
+          <w:p>
+            <w:pPr>
+              <w:jc w:val="left"/>
+            </w:pPr>
+            <w:r>
+              <w:rPr>
+                <w:b/>
+                <w:bCs/>
+                <w:color w:val="C00000"/>
+                <w:sz w:val="18"/>
+                <w:szCs w:val="18"/>
+              </w:rPr>
+              <w:t xml:space="preserve">http://, TIMED_OUT/REFUSED</w:t>
+            </w:r>
+          </w:p>
+        </w:tc>
+        <w:tc>
+          <w:tcPr>
+            <w:tcW w:type="dxa" w:w="2000"/>
+            <w:tcMar>
+              <w:top w:type="dxa" w:w="40"/>
+              <w:left w:type="dxa" w:w="80"/>
+              <w:bottom w:type="dxa" w:w="40"/>
+              <w:right w:type="dxa" w:w="80"/>
+            </w:tcMar>
+          </w:tcPr>
+          <w:p>
+            <w:pPr>
+              <w:jc w:val="left"/>
+            </w:pPr>
+            <w:r>
+              <w:rPr>
+                <w:sz w:val="18"/>
+                <w:szCs w:val="18"/>
+              </w:rPr>
+              <w:t xml:space="preserve">—</w:t>
+            </w:r>
+          </w:p>
+        </w:tc>
+        <w:tc>
+          <w:tcPr>
+            <w:tcW w:type="dxa" w:w="2200"/>
+            <w:tcMar>
+              <w:top w:type="dxa" w:w="40"/>
+              <w:left w:type="dxa" w:w="80"/>
+              <w:bottom w:type="dxa" w:w="40"/>
+              <w:right w:type="dxa" w:w="80"/>
+            </w:tcMar>
+          </w:tcPr>
+          <w:p>
+            <w:pPr>
+              <w:jc w:val="left"/>
+            </w:pPr>
+            <w:r>
+              <w:rPr>
+                <w:sz w:val="18"/>
+                <w:szCs w:val="18"/>
+              </w:rPr>
+              <w:t xml:space="preserve">https://, ERR_TUNNEL_CONNECTION_FAILED</w:t>
+            </w:r>
+          </w:p>
+        </w:tc>
+      </w:tr>
+      <w:tr>
+        <w:tc>
+          <w:tcPr>
+            <w:tcW w:type="dxa" w:w="2200"/>
+            <w:tcMar>
+              <w:top w:type="dxa" w:w="40"/>
+              <w:left w:type="dxa" w:w="80"/>
+              <w:bottom w:type="dxa" w:w="40"/>
+              <w:right w:type="dxa" w:w="80"/>
+            </w:tcMar>
+          </w:tcPr>
+          <w:p>
+            <w:pPr>
+              <w:jc w:val="left"/>
+            </w:pPr>
+            <w:r>
+              <w:rPr>
+                <w:sz w:val="18"/>
+                <w:szCs w:val="18"/>
+              </w:rPr>
+              <w:t xml:space="preserve">Таблица НПА</w:t>
+            </w:r>
+          </w:p>
+        </w:tc>
+        <w:tc>
+          <w:tcPr>
+            <w:tcW w:type="dxa" w:w="2200"/>
+            <w:tcMar>
+              <w:top w:type="dxa" w:w="40"/>
+              <w:left w:type="dxa" w:w="80"/>
+              <w:bottom w:type="dxa" w:w="40"/>
+              <w:right w:type="dxa" w:w="80"/>
+            </w:tcMar>
+          </w:tcPr>
+          <w:p>
+            <w:pPr>
+              <w:jc w:val="left"/>
+            </w:pPr>
+            <w:r>
+              <w:rPr>
+                <w:b/>
+                <w:bCs/>
+                <w:color w:val="B26A00"/>
+                <w:sz w:val="18"/>
+                <w:szCs w:val="18"/>
+              </w:rPr>
+              <w:t xml:space="preserve">10 актов, цели не верифицированы</w:t>
+            </w:r>
+          </w:p>
+        </w:tc>
+        <w:tc>
+          <w:tcPr>
+            <w:tcW w:type="dxa" w:w="2000"/>
+            <w:tcMar>
+              <w:top w:type="dxa" w:w="40"/>
+              <w:left w:type="dxa" w:w="80"/>
+              <w:bottom w:type="dxa" w:w="40"/>
+              <w:right w:type="dxa" w:w="80"/>
+            </w:tcMar>
+          </w:tcPr>
+          <w:p>
+            <w:pPr>
+              <w:jc w:val="left"/>
+            </w:pPr>
+            <w:r>
+              <w:rPr>
+                <w:sz w:val="18"/>
+                <w:szCs w:val="18"/>
+              </w:rPr>
+              <w:t xml:space="preserve">—</w:t>
+            </w:r>
+          </w:p>
+        </w:tc>
+        <w:tc>
+          <w:tcPr>
+            <w:tcW w:type="dxa" w:w="2200"/>
+            <w:tcMar>
+              <w:top w:type="dxa" w:w="40"/>
+              <w:left w:type="dxa" w:w="80"/>
+              <w:bottom w:type="dxa" w:w="40"/>
+              <w:right w:type="dxa" w:w="80"/>
+            </w:tcMar>
+          </w:tcPr>
+          <w:p>
+            <w:pPr>
+              <w:jc w:val="left"/>
+            </w:pPr>
+            <w:r>
+              <w:rPr>
+                <w:sz w:val="18"/>
+                <w:szCs w:val="18"/>
+              </w:rPr>
+              <w:t xml:space="preserve">25+ актов, верифицированы</w:t>
+            </w:r>
+          </w:p>
+        </w:tc>
+      </w:tr>
+      <w:tr>
+        <w:tc>
+          <w:tcPr>
+            <w:tcW w:type="dxa" w:w="2200"/>
+            <w:tcMar>
+              <w:top w:type="dxa" w:w="40"/>
+              <w:left w:type="dxa" w:w="80"/>
+              <w:bottom w:type="dxa" w:w="40"/>
+              <w:right w:type="dxa" w:w="80"/>
+            </w:tcMar>
+          </w:tcPr>
+          <w:p>
+            <w:pPr>
+              <w:jc w:val="left"/>
+            </w:pPr>
+            <w:r>
+              <w:rPr>
+                <w:sz w:val="18"/>
+                <w:szCs w:val="18"/>
+              </w:rPr>
+              <w:t xml:space="preserve">Юридическая база</w:t>
+            </w:r>
+          </w:p>
+        </w:tc>
+        <w:tc>
+          <w:tcPr>
+            <w:tcW w:type="dxa" w:w="2200"/>
+            <w:tcMar>
+              <w:top w:type="dxa" w:w="40"/>
+              <w:left w:type="dxa" w:w="80"/>
+              <w:bottom w:type="dxa" w:w="40"/>
+              <w:right w:type="dxa" w:w="80"/>
+            </w:tcMar>
+          </w:tcPr>
+          <w:p>
+            <w:pPr>
+              <w:jc w:val="left"/>
+            </w:pPr>
+            <w:r>
+              <w:rPr>
+                <w:sz w:val="18"/>
+                <w:szCs w:val="18"/>
+              </w:rPr>
+              <w:t xml:space="preserve">обтекаемо</w:t>
+            </w:r>
+          </w:p>
+        </w:tc>
+        <w:tc>
+          <w:tcPr>
+            <w:tcW w:type="dxa" w:w="2000"/>
+            <w:tcMar>
+              <w:top w:type="dxa" w:w="40"/>
+              <w:left w:type="dxa" w:w="80"/>
+              <w:bottom w:type="dxa" w:w="40"/>
+              <w:right w:type="dxa" w:w="80"/>
+            </w:tcMar>
+          </w:tcPr>
+          <w:p>
+            <w:pPr>
+              <w:jc w:val="left"/>
+            </w:pPr>
+            <w:r>
+              <w:rPr>
+                <w:b/>
+                <w:bCs/>
+                <w:color w:val="2E7D32"/>
+                <w:sz w:val="18"/>
+                <w:szCs w:val="18"/>
+              </w:rPr>
+              <w:t xml:space="preserve">ст.83-1 ПК, Приказ МНЭ №131, 7 граф</w:t>
+            </w:r>
+          </w:p>
+        </w:tc>
+        <w:tc>
+          <w:tcPr>
+            <w:tcW w:type="dxa" w:w="2200"/>
+            <w:tcMar>
+              <w:top w:type="dxa" w:w="40"/>
+              <w:left w:type="dxa" w:w="80"/>
+              <w:bottom w:type="dxa" w:w="40"/>
+              <w:right w:type="dxa" w:w="80"/>
+            </w:tcMar>
+          </w:tcPr>
+          <w:p>
+            <w:pPr>
+              <w:jc w:val="left"/>
+            </w:pPr>
+            <w:r>
+              <w:rPr>
+                <w:sz w:val="18"/>
+                <w:szCs w:val="18"/>
+              </w:rPr>
+              <w:t xml:space="preserve">подтверждаю релевантность</w:t>
+            </w:r>
+          </w:p>
+        </w:tc>
+      </w:tr>
+      <w:tr>
+        <w:tc>
+          <w:tcPr>
+            <w:tcW w:type="dxa" w:w="2200"/>
+            <w:tcMar>
+              <w:top w:type="dxa" w:w="40"/>
+              <w:left w:type="dxa" w:w="80"/>
+              <w:bottom w:type="dxa" w:w="40"/>
+              <w:right w:type="dxa" w:w="80"/>
+            </w:tcMar>
+          </w:tcPr>
+          <w:p>
+            <w:pPr>
+              <w:jc w:val="left"/>
+            </w:pPr>
+            <w:r>
+              <w:rPr>
+                <w:sz w:val="18"/>
+                <w:szCs w:val="18"/>
+              </w:rPr>
+              <w:t xml:space="preserve">Формальное vs сущностное</w:t>
+            </w:r>
+          </w:p>
+        </w:tc>
+        <w:tc>
+          <w:tcPr>
+            <w:tcW w:type="dxa" w:w="2200"/>
+            <w:tcMar>
+              <w:top w:type="dxa" w:w="40"/>
+              <w:left w:type="dxa" w:w="80"/>
+              <w:bottom w:type="dxa" w:w="40"/>
+              <w:right w:type="dxa" w:w="80"/>
+            </w:tcMar>
+          </w:tcPr>
+          <w:p>
+            <w:pPr>
+              <w:jc w:val="left"/>
+            </w:pPr>
+            <w:r>
+              <w:rPr>
+                <w:sz w:val="18"/>
+                <w:szCs w:val="18"/>
+              </w:rPr>
+              <w:t xml:space="preserve">не различает</w:t>
+            </w:r>
+          </w:p>
+        </w:tc>
+        <w:tc>
+          <w:tcPr>
+            <w:tcW w:type="dxa" w:w="2000"/>
+            <w:tcMar>
+              <w:top w:type="dxa" w:w="40"/>
+              <w:left w:type="dxa" w:w="80"/>
+              <w:bottom w:type="dxa" w:w="40"/>
+              <w:right w:type="dxa" w:w="80"/>
+            </w:tcMar>
+          </w:tcPr>
+          <w:p>
+            <w:pPr>
+              <w:jc w:val="left"/>
+            </w:pPr>
+            <w:r>
+              <w:rPr>
+                <w:b/>
+                <w:bCs/>
+                <w:color w:val="2E7D32"/>
+                <w:sz w:val="18"/>
+                <w:szCs w:val="18"/>
+              </w:rPr>
+              <w:t xml:space="preserve">7/10 формально vs 2/10 сущностно</w:t>
+            </w:r>
+          </w:p>
+        </w:tc>
+        <w:tc>
+          <w:tcPr>
+            <w:tcW w:type="dxa" w:w="2200"/>
+            <w:tcMar>
+              <w:top w:type="dxa" w:w="40"/>
+              <w:left w:type="dxa" w:w="80"/>
+              <w:bottom w:type="dxa" w:w="40"/>
+              <w:right w:type="dxa" w:w="80"/>
+            </w:tcMar>
+          </w:tcPr>
+          <w:p>
+            <w:pPr>
+              <w:jc w:val="left"/>
+            </w:pPr>
+            <w:r>
+              <w:rPr>
+                <w:sz w:val="18"/>
+                <w:szCs w:val="18"/>
+              </w:rPr>
+              <w:t xml:space="preserve">согласен: графы есть, функции нет</w:t>
+            </w:r>
+          </w:p>
+        </w:tc>
+      </w:tr>
+      <w:tr>
+        <w:tc>
+          <w:tcPr>
+            <w:tcW w:type="dxa" w:w="2200"/>
+            <w:tcMar>
+              <w:top w:type="dxa" w:w="40"/>
+              <w:left w:type="dxa" w:w="80"/>
+              <w:bottom w:type="dxa" w:w="40"/>
+              <w:right w:type="dxa" w:w="80"/>
+            </w:tcMar>
+          </w:tcPr>
+          <w:p>
+            <w:pPr>
+              <w:jc w:val="left"/>
+            </w:pPr>
+            <w:r>
+              <w:rPr>
+                <w:sz w:val="18"/>
+                <w:szCs w:val="18"/>
+              </w:rPr>
+              <w:t xml:space="preserve">node1 disclosure</w:t>
+            </w:r>
+          </w:p>
+        </w:tc>
+        <w:tc>
+          <w:tcPr>
+            <w:tcW w:type="dxa" w:w="2200"/>
+            <w:tcMar>
+              <w:top w:type="dxa" w:w="40"/>
+              <w:left w:type="dxa" w:w="80"/>
+              <w:bottom w:type="dxa" w:w="40"/>
+              <w:right w:type="dxa" w:w="80"/>
+            </w:tcMar>
+          </w:tcPr>
+          <w:p>
+            <w:pPr>
+              <w:jc w:val="left"/>
+            </w:pPr>
+            <w:r>
+              <w:rPr>
+                <w:b/>
+                <w:bCs/>
+                <w:color w:val="C00000"/>
+                <w:sz w:val="18"/>
+                <w:szCs w:val="18"/>
+              </w:rPr>
+              <w:t xml:space="preserve">не найдено</w:t>
+            </w:r>
+          </w:p>
+        </w:tc>
+        <w:tc>
+          <w:tcPr>
+            <w:tcW w:type="dxa" w:w="2000"/>
+            <w:tcMar>
+              <w:top w:type="dxa" w:w="40"/>
+              <w:left w:type="dxa" w:w="80"/>
+              <w:bottom w:type="dxa" w:w="40"/>
+              <w:right w:type="dxa" w:w="80"/>
+            </w:tcMar>
+          </w:tcPr>
+          <w:p>
+            <w:pPr>
+              <w:jc w:val="left"/>
+            </w:pPr>
+            <w:r>
+              <w:rPr>
+                <w:sz w:val="18"/>
+                <w:szCs w:val="18"/>
+              </w:rPr>
+              <w:t xml:space="preserve">упоминает</w:t>
+            </w:r>
+          </w:p>
+        </w:tc>
+        <w:tc>
+          <w:tcPr>
+            <w:tcW w:type="dxa" w:w="2200"/>
+            <w:tcMar>
+              <w:top w:type="dxa" w:w="40"/>
+              <w:left w:type="dxa" w:w="80"/>
+              <w:bottom w:type="dxa" w:w="40"/>
+              <w:right w:type="dxa" w:w="80"/>
+            </w:tcMar>
+          </w:tcPr>
+          <w:p>
+            <w:pPr>
+              <w:jc w:val="left"/>
+            </w:pPr>
+            <w:r>
+              <w:rPr>
+                <w:b/>
+                <w:bCs/>
+                <w:color w:val="2E7D32"/>
+                <w:sz w:val="18"/>
+                <w:szCs w:val="18"/>
+              </w:rPr>
+              <w:t xml:space="preserve">подтверждено (HTML-комментарий)</w:t>
+            </w:r>
+          </w:p>
+        </w:tc>
+      </w:tr>
+      <w:tr>
+        <w:tc>
+          <w:tcPr>
+            <w:tcW w:type="dxa" w:w="2200"/>
+            <w:tcMar>
+              <w:top w:type="dxa" w:w="40"/>
+              <w:left w:type="dxa" w:w="80"/>
+              <w:bottom w:type="dxa" w:w="40"/>
+              <w:right w:type="dxa" w:w="80"/>
+            </w:tcMar>
+          </w:tcPr>
+          <w:p>
+            <w:pPr>
+              <w:jc w:val="left"/>
+            </w:pPr>
+            <w:r>
+              <w:rPr>
+                <w:sz w:val="18"/>
+                <w:szCs w:val="18"/>
+              </w:rPr>
+              <w:t xml:space="preserve">Экспозиция ИИН/ФИО</w:t>
+            </w:r>
+          </w:p>
+        </w:tc>
+        <w:tc>
+          <w:tcPr>
+            <w:tcW w:type="dxa" w:w="2200"/>
+            <w:tcMar>
+              <w:top w:type="dxa" w:w="40"/>
+              <w:left w:type="dxa" w:w="80"/>
+              <w:bottom w:type="dxa" w:w="40"/>
+              <w:right w:type="dxa" w:w="80"/>
+            </w:tcMar>
+          </w:tcPr>
+          <w:p>
+            <w:pPr>
+              <w:jc w:val="left"/>
+            </w:pPr>
+            <w:r>
+              <w:rPr>
+                <w:b/>
+                <w:bCs/>
+                <w:color w:val="C00000"/>
+                <w:sz w:val="18"/>
+                <w:szCs w:val="18"/>
+              </w:rPr>
+              <w:t xml:space="preserve">пропущено</w:t>
+            </w:r>
+          </w:p>
+        </w:tc>
+        <w:tc>
+          <w:tcPr>
+            <w:tcW w:type="dxa" w:w="2000"/>
+            <w:tcMar>
+              <w:top w:type="dxa" w:w="40"/>
+              <w:left w:type="dxa" w:w="80"/>
+              <w:bottom w:type="dxa" w:w="40"/>
+              <w:right w:type="dxa" w:w="80"/>
+            </w:tcMar>
+          </w:tcPr>
+          <w:p>
+            <w:pPr>
+              <w:jc w:val="left"/>
+            </w:pPr>
+            <w:r>
+              <w:rPr>
+                <w:sz w:val="18"/>
+                <w:szCs w:val="18"/>
+              </w:rPr>
+              <w:t xml:space="preserve">упоминает</w:t>
+            </w:r>
+          </w:p>
+        </w:tc>
+        <w:tc>
+          <w:tcPr>
+            <w:tcW w:type="dxa" w:w="2200"/>
+            <w:tcMar>
+              <w:top w:type="dxa" w:w="40"/>
+              <w:left w:type="dxa" w:w="80"/>
+              <w:bottom w:type="dxa" w:w="40"/>
+              <w:right w:type="dxa" w:w="80"/>
+            </w:tcMar>
+          </w:tcPr>
+          <w:p>
+            <w:pPr>
+              <w:jc w:val="left"/>
+            </w:pPr>
+            <w:r>
+              <w:rPr>
+                <w:sz w:val="18"/>
+                <w:szCs w:val="18"/>
+              </w:rPr>
+              <w:t xml:space="preserve">подтверждено; калибровано (раздел 5.2)</w:t>
+            </w:r>
+          </w:p>
+        </w:tc>
+      </w:tr>
+      <w:tr>
+        <w:tc>
+          <w:tcPr>
+            <w:tcW w:type="dxa" w:w="2200"/>
+            <w:tcMar>
+              <w:top w:type="dxa" w:w="40"/>
+              <w:left w:type="dxa" w:w="80"/>
+              <w:bottom w:type="dxa" w:w="40"/>
+              <w:right w:type="dxa" w:w="80"/>
+            </w:tcMar>
+          </w:tcPr>
+          <w:p>
+            <w:pPr>
+              <w:jc w:val="left"/>
+            </w:pPr>
+            <w:r>
+              <w:rPr>
+                <w:sz w:val="18"/>
+                <w:szCs w:val="18"/>
+              </w:rPr>
+              <w:t xml:space="preserve">Эндпоинты login/certificate</w:t>
+            </w:r>
+          </w:p>
+        </w:tc>
+        <w:tc>
+          <w:tcPr>
+            <w:tcW w:type="dxa" w:w="2200"/>
+            <w:tcMar>
+              <w:top w:type="dxa" w:w="40"/>
+              <w:left w:type="dxa" w:w="80"/>
+              <w:bottom w:type="dxa" w:w="40"/>
+              <w:right w:type="dxa" w:w="80"/>
+            </w:tcMar>
+          </w:tcPr>
+          <w:p>
+            <w:pPr>
+              <w:jc w:val="left"/>
+            </w:pPr>
+            <w:r>
+              <w:rPr>
+                <w:b/>
+                <w:bCs/>
+                <w:color w:val="2E7D32"/>
+                <w:sz w:val="18"/>
+                <w:szCs w:val="18"/>
+              </w:rPr>
+              <w:t xml:space="preserve">указаны (ЭЦП/QR/FaceID)</w:t>
+            </w:r>
+          </w:p>
+        </w:tc>
+        <w:tc>
+          <w:tcPr>
+            <w:tcW w:type="dxa" w:w="2000"/>
+            <w:tcMar>
+              <w:top w:type="dxa" w:w="40"/>
+              <w:left w:type="dxa" w:w="80"/>
+              <w:bottom w:type="dxa" w:w="40"/>
+              <w:right w:type="dxa" w:w="80"/>
+            </w:tcMar>
+          </w:tcPr>
+          <w:p>
+            <w:pPr>
+              <w:jc w:val="left"/>
+            </w:pPr>
+            <w:r>
+              <w:rPr>
+                <w:sz w:val="18"/>
+                <w:szCs w:val="18"/>
+              </w:rPr>
+              <w:t xml:space="preserve">—</w:t>
+            </w:r>
+          </w:p>
+        </w:tc>
+        <w:tc>
+          <w:tcPr>
+            <w:tcW w:type="dxa" w:w="2200"/>
+            <w:tcMar>
+              <w:top w:type="dxa" w:w="40"/>
+              <w:left w:type="dxa" w:w="80"/>
+              <w:bottom w:type="dxa" w:w="40"/>
+              <w:right w:type="dxa" w:w="80"/>
+            </w:tcMar>
+          </w:tcPr>
+          <w:p>
+            <w:pPr>
+              <w:jc w:val="left"/>
+            </w:pPr>
+            <w:r>
+              <w:rPr>
+                <w:b/>
+                <w:bCs/>
+                <w:color w:val="2E7D32"/>
+                <w:sz w:val="18"/>
+                <w:szCs w:val="18"/>
+              </w:rPr>
+              <w:t xml:space="preserve">верно (HTTP 200)</w:t>
+            </w:r>
+          </w:p>
+        </w:tc>
+      </w:tr>
+      <w:tr>
+        <w:tc>
+          <w:tcPr>
+            <w:tcW w:type="dxa" w:w="2200"/>
+            <w:tcMar>
+              <w:top w:type="dxa" w:w="40"/>
+              <w:left w:type="dxa" w:w="80"/>
+              <w:bottom w:type="dxa" w:w="40"/>
+              <w:right w:type="dxa" w:w="80"/>
+            </w:tcMar>
+          </w:tcPr>
+          <w:p>
+            <w:pPr>
+              <w:jc w:val="left"/>
+            </w:pPr>
+            <w:r>
+              <w:rPr>
+                <w:sz w:val="18"/>
+                <w:szCs w:val="18"/>
+              </w:rPr>
+              <w:t xml:space="preserve">Итоговый балл</w:t>
+            </w:r>
+          </w:p>
+        </w:tc>
+        <w:tc>
+          <w:tcPr>
+            <w:tcW w:type="dxa" w:w="2200"/>
+            <w:tcMar>
+              <w:top w:type="dxa" w:w="40"/>
+              <w:left w:type="dxa" w:w="80"/>
+              <w:bottom w:type="dxa" w:w="40"/>
+              <w:right w:type="dxa" w:w="80"/>
+            </w:tcMar>
+          </w:tcPr>
+          <w:p>
+            <w:pPr>
+              <w:jc w:val="left"/>
+            </w:pPr>
+            <w:r>
+              <w:rPr>
+                <w:sz w:val="18"/>
+                <w:szCs w:val="18"/>
+              </w:rPr>
+              <w:t xml:space="preserve">2,6 / 10</w:t>
+            </w:r>
+          </w:p>
+        </w:tc>
+        <w:tc>
+          <w:tcPr>
+            <w:tcW w:type="dxa" w:w="2000"/>
+            <w:tcMar>
+              <w:top w:type="dxa" w:w="40"/>
+              <w:left w:type="dxa" w:w="80"/>
+              <w:bottom w:type="dxa" w:w="40"/>
+              <w:right w:type="dxa" w:w="80"/>
+            </w:tcMar>
+          </w:tcPr>
+          <w:p>
+            <w:pPr>
+              <w:jc w:val="left"/>
+            </w:pPr>
+            <w:r>
+              <w:rPr>
+                <w:sz w:val="18"/>
+                <w:szCs w:val="18"/>
+              </w:rPr>
+              <w:t xml:space="preserve">2/10 (сущностно) · 7/10 (формально)</w:t>
+            </w:r>
+          </w:p>
+        </w:tc>
+        <w:tc>
+          <w:tcPr>
+            <w:tcW w:type="dxa" w:w="2200"/>
+            <w:tcMar>
+              <w:top w:type="dxa" w:w="40"/>
+              <w:left w:type="dxa" w:w="80"/>
+              <w:bottom w:type="dxa" w:w="40"/>
+              <w:right w:type="dxa" w:w="80"/>
+            </w:tcMar>
+          </w:tcPr>
+          <w:p>
+            <w:pPr>
+              <w:jc w:val="left"/>
+            </w:pPr>
+            <w:r>
+              <w:rPr>
+                <w:sz w:val="18"/>
+                <w:szCs w:val="18"/>
+              </w:rPr>
+              <w:t xml:space="preserve">≈ 2,0 / 10</w:t>
+            </w:r>
+          </w:p>
+        </w:tc>
+      </w:tr>
+    </w:tbl>
+    <w:p>
+      <w:pPr>
+        <w:pStyle w:val="Heading2"/>
+        <w:spacing w:after="100" w:before="220"/>
+      </w:pPr>
+      <w:r>
+        <w:t xml:space="preserve">Выводы сравнения</w:t>
+      </w:r>
+    </w:p>
+    <w:p>
+      <w:pPr>
+        <w:pStyle w:val="ListParagraph"/>
+        <w:numPr>
+          <w:ilvl w:val="0"/>
+          <w:numId w:val="2"/>
+        </w:numPr>
+        <w:spacing w:after="60"/>
+      </w:pPr>
+      <w:r>
+        <w:rPr>
+          <w:b/>
+          <w:bCs/>
+          <w:sz w:val="22"/>
+          <w:szCs w:val="22"/>
+        </w:rPr>
+        <w:t xml:space="preserve">Qwen — сильнее в праве: </w:t>
+      </w:r>
+      <w:r>
+        <w:rPr>
+          <w:sz w:val="22"/>
+          <w:szCs w:val="22"/>
+        </w:rPr>
+        <w:t xml:space="preserve">единственный привязал оценку к конкретным НПА (ст. 83-1 Предпринимательского кодекса, Приказ МНЭ № 131 с 7 обязательными графами) и ввёл важное различие «формальное соответствие (7/10) против сущностного (2/10)». Его проверяемые технические факты (реальные IP, 72,6 %, node1, ИИН/БИН) совпадают с наблюдениями данного аудита.</w:t>
+      </w:r>
+    </w:p>
+    <w:p>
+      <w:pPr>
+        <w:pStyle w:val="ListParagraph"/>
+        <w:numPr>
+          <w:ilvl w:val="0"/>
+          <w:numId w:val="2"/>
+        </w:numPr>
+        <w:spacing w:after="60"/>
+      </w:pPr>
+      <w:r>
+        <w:rPr>
+          <w:b/>
+          <w:bCs/>
+          <w:sz w:val="22"/>
+          <w:szCs w:val="22"/>
+        </w:rPr>
+        <w:t xml:space="preserve">Gemini — слабее в фактах: </w:t>
+      </w:r>
+      <w:r>
+        <w:rPr>
+          <w:sz w:val="22"/>
+          <w:szCs w:val="22"/>
+        </w:rPr>
+        <w:t xml:space="preserve">верно уловил общий диагноз, структуру разделов и служебные эндпоинты, но ошибся в архитектуре (SPA/API вместо SSR), использовал выдуманные 192.168.* и http://, привёл непроверенную таблицу НПА и не заметил двух реальных ИБ-моментов (node1 и экспозицию ИИН). Гипотеза «остатки тестового контура» правдоподобна, но не подкреплена данными.</w:t>
+      </w:r>
+    </w:p>
+    <w:p>
+      <w:pPr>
+        <w:pStyle w:val="ListParagraph"/>
+        <w:numPr>
+          <w:ilvl w:val="0"/>
+          <w:numId w:val="2"/>
+        </w:numPr>
+        <w:spacing w:after="60"/>
+      </w:pPr>
+      <w:r>
+        <w:rPr>
+          <w:b/>
+          <w:bCs/>
+          <w:sz w:val="22"/>
+          <w:szCs w:val="22"/>
+        </w:rPr>
+        <w:t xml:space="preserve">Данный аудит — «наземная правда»: </w:t>
+      </w:r>
+      <w:r>
+        <w:rPr>
+          <w:sz w:val="22"/>
+          <w:szCs w:val="22"/>
+        </w:rPr>
+        <w:t xml:space="preserve">точные IP, реальный тип ошибки, подтверждённый SSR (не SPA), раскрытие node1 и калиброванная (не завышенная) оценка ситуации с ИИН/БИН.</w:t>
+      </w:r>
+    </w:p>
+    <w:p>
+      <w:r>
+        <w:br w:type="page"/>
+      </w:r>
+    </w:p>
+    <w:p>
+      <w:pPr>
+        <w:pStyle w:val="Heading1"/>
+        <w:spacing w:after="120" w:before="280"/>
+      </w:pPr>
+      <w:r>
+        <w:t xml:space="preserve">14. Итоговая экспертная оценка (10-балльная шкала)</w:t>
       </w:r>
     </w:p>
     <w:tbl>
@@ -9417,7 +11246,7 @@
                 <w:sz w:val="18"/>
                 <w:szCs w:val="18"/>
               </w:rPr>
-              <w:t xml:space="preserve">Внутренние IP в HTML, нет нормализации, нет API</w:t>
+              <w:t xml:space="preserve">Внутренние IP/node1 в HTML, нет нормализации, нет API</w:t>
             </w:r>
           </w:p>
         </w:tc>
@@ -9784,13 +11613,34 @@
         </w:tc>
       </w:tr>
     </w:tbl>
+    <w:p>
+      <w:pPr>
+        <w:spacing w:after="120" w:line="276"/>
+      </w:pPr>
+      <w:r>
+        <w:rPr>
+          <w:b/>
+          <w:bCs/>
+          <w:sz w:val="22"/>
+          <w:szCs w:val="22"/>
+        </w:rPr>
+        <w:t xml:space="preserve">Примечание (рамка Qwen). </w:t>
+      </w:r>
+      <w:r>
+        <w:rPr>
+          <w:sz w:val="22"/>
+          <w:szCs w:val="22"/>
+        </w:rPr>
+        <w:t xml:space="preserve">Отдельно стоит различать формальное соответствие подзаконному акту (Приказ МНЭ № 131 — все 7 граф формально присутствуют, оценка ~7/10) и сущностное соответствие цели закона и поручению (информированность об исчерпывающем перечне требований — ~2/10). Данная интегральная оценка отражает именно сущностную сторону — фактическую пользу для предпринимателя.</w:t>
+      </w:r>
+    </w:p>
     <w:p>
       <w:pPr>
         <w:pStyle w:val="Heading1"/>
         <w:spacing w:after="120" w:before="280"/>
       </w:pPr>
       <w:r>
-        <w:t xml:space="preserve">13. Технические причины и рекомендации</w:t>
+        <w:t xml:space="preserve">15. Технические причины и рекомендации</w:t>
       </w:r>
     </w:p>
     <w:p>
@@ -9799,7 +11649,7 @@
         <w:spacing w:after="100" w:before="220"/>
       </w:pPr>
       <w:r>
-        <w:t xml:space="preserve">13.1. Причины</w:t>
+        <w:t xml:space="preserve">15.1. Причины</w:t>
       </w:r>
     </w:p>
     <w:p>
@@ -9850,7 +11700,7 @@
           <w:sz w:val="22"/>
           <w:szCs w:val="22"/>
         </w:rPr>
-        <w:t xml:space="preserve">Импорт данных из нескольких разнородных систем без унификации и валидации URL — отсюда битые/искажённые ссылки.</w:t>
+        <w:t xml:space="preserve">Импорт данных из нескольких разнородных систем без унификации и валидации URL.</w:t>
       </w:r>
     </w:p>
     <w:p>
@@ -9876,7 +11726,7 @@
         <w:spacing w:after="100" w:before="220"/>
       </w:pPr>
       <w:r>
-        <w:t xml:space="preserve">13.2. Рекомендации (по приоритету)</w:t>
+        <w:t xml:space="preserve">15.2. Рекомендации (по приоритету)</w:t>
       </w:r>
     </w:p>
     <w:p>
@@ -9916,10 +11766,19 @@
       </w:pPr>
       <w:r>
         <w:rPr>
+          <w:b/>
+          <w:bCs/>
           <w:sz w:val="22"/>
           <w:szCs w:val="22"/>
         </w:rPr>
-        <w:t xml:space="preserve">Устранить утечку внутренней топологии сети (приватные IP в публичном HTML) — как дефект информационной безопасности.</w:t>
+        <w:t xml:space="preserve">ИБ: </w:t>
+      </w:r>
+      <w:r>
+        <w:rPr>
+          <w:sz w:val="22"/>
+          <w:szCs w:val="22"/>
+        </w:rPr>
+        <w:t xml:space="preserve">удалить из публичного HTML внутренние IP, имя узла node1.rsp.gov.kz и контакт подрядчика (HTML-комментарий) — раскрытие внутренней инфраструктуры.</w:t>
       </w:r>
     </w:p>
     <w:p>
@@ -9936,7 +11795,7 @@
           <w:sz w:val="22"/>
           <w:szCs w:val="22"/>
         </w:rPr>
-        <w:t xml:space="preserve">Внедрить автоматическую валидацию ссылок (link-checker) в конвейер публикации и регулярный мониторинг 4xx/недостижимых узлов.</w:t>
+        <w:t xml:space="preserve">Внедрить автоматическую валидацию ссылок (link-checker) в конвейер публикации и мониторинг 4xx/недостижимых узлов.</w:t>
       </w:r>
     </w:p>
     <w:p>
@@ -9954,6 +11813,32 @@
           <w:szCs w:val="22"/>
         </w:rPr>
         <w:t xml:space="preserve">Исправить генерацию URL в шаблонах (потеря префикса https:// и мусорная конкатенация).</w:t>
+      </w:r>
+    </w:p>
+    <w:p>
+      <w:pPr>
+        <w:pStyle w:val="ListParagraph"/>
+        <w:numPr>
+          <w:ilvl w:val="0"/>
+          <w:numId w:val="3"/>
+        </w:numPr>
+        <w:spacing w:after="60"/>
+      </w:pPr>
+      <w:r>
+        <w:rPr>
+          <w:sz w:val="22"/>
+          <w:szCs w:val="22"/>
+        </w:rPr>
+        <w:t xml:space="preserve">Data-governance (по необходимости): для РСП рассмотреть ограничение массовой перечисляемости/выгрузки (rate-limit, anti-scraping), поскольку датасет содержит ИИН (ПДн с датой рождения). </w:t>
+      </w:r>
+      <w:r>
+        <w:rPr>
+          <w:i/>
+          <w:iCs/>
+          <w:sz w:val="22"/>
+          <w:szCs w:val="22"/>
+        </w:rPr>
+        <w:t xml:space="preserve">Это рекомендация уровня политики данных, а не устранение уязвимости.</w:t>
       </w:r>
     </w:p>
     <w:p>

</xml_diff>

<commit_message>
Consolidate audit into a single unified report (own findings)
- Remove the three-way comparison section; present all verified substance as the
  audit's own conclusions.
- New section 10 "Нормативная база и соответствие назначению": Article 83-1 of the
  Entrepreneurial Code verified directly against adilet.zan.kz (registry is a
  statutory "общедоступная база данных"; task = exhaustive informing; laws included
  постатейно; non-analysis -> removal). Adds a formal (~7/10) vs substantive (~2/10)
  compliance distinction as the audit's own analysis.
- Keep InfoSec section (internal IPs + node1 disclosure confirmed; РСП BIN/IIN
  downgraded to a data-governance observation with explicit retraction note).
- REPORT.md rewritten to mirror the consolidated .docx.

Co-Authored-By: Claude Fable 5 <noreply@anthropic.com>
Claude-Session: https://claude.ai/code/session_01CB6mNZscycJfpBtPLQVGLv
</commit_message>
<xml_diff>
--- a/rsp-audit/RSP_gov_kz_Audit_Report.docx
+++ b/rsp-audit/RSP_gov_kz_Audit_Report.docx
@@ -73,7 +73,7 @@
           <w:sz w:val="20"/>
           <w:szCs w:val="20"/>
         </w:rPr>
-        <w:t xml:space="preserve">Редакция 2 — добавлен раздел информационной безопасности и сравнение с независимыми заключениями (Gemini, Qwen)</w:t>
+        <w:t xml:space="preserve">Консолидированная редакция: единый отчёт, включающий раздел информационной безопасности и верифицированную нормативную базу</w:t>
       </w:r>
     </w:p>
     <w:p>
@@ -3492,7 +3492,7 @@
           <w:sz w:val="22"/>
           <w:szCs w:val="22"/>
         </w:rPr>
-        <w:t xml:space="preserve">В независимых заключениях (Gemini, Qwen) отмечались два ИБ-момента: раскрытие внутренней инфраструктуры и наличие ИИН/БИН. Ниже — проверенные по факту наблюдения и честная (не завышенная) калибровка серьёзности каждого.</w:t>
+        <w:t xml:space="preserve">В ходе аудита отдельно проверены два ИБ-момента: раскрытие внутренней инфраструктуры и публичное отображение ИИН/БИН. Ниже — проверенные по факту наблюдения и честная (не завышенная) калибровка серьёзности каждого.</w:t>
       </w:r>
     </w:p>
     <w:p>
@@ -8543,7 +8543,488 @@
         <w:spacing w:after="120" w:before="280"/>
       </w:pPr>
       <w:r>
-        <w:t xml:space="preserve">10. Соответствие назначению и архитектурный аудит</w:t>
+        <w:t xml:space="preserve">10. Нормативная база и соответствие назначению</w:t>
+      </w:r>
+    </w:p>
+    <w:p>
+      <w:pPr>
+        <w:pStyle w:val="Heading2"/>
+        <w:spacing w:after="100" w:before="220"/>
+      </w:pPr>
+      <w:r>
+        <w:t xml:space="preserve">10.1. Нормативная база (проверено по первоисточнику)</w:t>
+      </w:r>
+    </w:p>
+    <w:p>
+      <w:pPr>
+        <w:spacing w:after="120" w:line="276"/>
+      </w:pPr>
+      <w:r>
+        <w:rPr>
+          <w:sz w:val="22"/>
+          <w:szCs w:val="22"/>
+        </w:rPr>
+        <w:t xml:space="preserve">Основанием создания реестра является </w:t>
+      </w:r>
+      <w:r>
+        <w:rPr>
+          <w:b/>
+          <w:bCs/>
+          <w:sz w:val="22"/>
+          <w:szCs w:val="22"/>
+        </w:rPr>
+        <w:t xml:space="preserve">статья 83-1 Предпринимательского кодекса РК</w:t>
+      </w:r>
+      <w:r>
+        <w:rPr>
+          <w:sz w:val="22"/>
+          <w:szCs w:val="22"/>
+        </w:rPr>
+        <w:t xml:space="preserve"> (введена Законом РК от 02.01.2021 № 400-VI). Текст статьи проверен непосредственно в ИПС «Әділет». Ключевые положения:</w:t>
+      </w:r>
+    </w:p>
+    <w:p>
+      <w:pPr>
+        <w:pStyle w:val="ListParagraph"/>
+        <w:numPr>
+          <w:ilvl w:val="0"/>
+          <w:numId w:val="2"/>
+        </w:numPr>
+        <w:spacing w:after="60"/>
+      </w:pPr>
+      <w:r>
+        <w:rPr>
+          <w:b/>
+          <w:bCs/>
+          <w:sz w:val="22"/>
+          <w:szCs w:val="22"/>
+        </w:rPr>
+        <w:t xml:space="preserve">Определение (п. 1): </w:t>
+      </w:r>
+      <w:r>
+        <w:rPr>
+          <w:sz w:val="22"/>
+          <w:szCs w:val="22"/>
+        </w:rPr>
+        <w:t xml:space="preserve">«общедоступная база данных регуляторных актов в разрезе видов предпринимательской деятельности по ОКЭД».</w:t>
+      </w:r>
+    </w:p>
+    <w:p>
+      <w:pPr>
+        <w:pStyle w:val="ListParagraph"/>
+        <w:numPr>
+          <w:ilvl w:val="0"/>
+          <w:numId w:val="2"/>
+        </w:numPr>
+        <w:spacing w:after="60"/>
+      </w:pPr>
+      <w:r>
+        <w:rPr>
+          <w:b/>
+          <w:bCs/>
+          <w:sz w:val="22"/>
+          <w:szCs w:val="22"/>
+        </w:rPr>
+        <w:t xml:space="preserve">Задачи (п. 1): </w:t>
+      </w:r>
+      <w:r>
+        <w:rPr>
+          <w:sz w:val="22"/>
+          <w:szCs w:val="22"/>
+        </w:rPr>
+        <w:t xml:space="preserve">1) обеспечение соответствия требований условиям их формирования; 2) «обеспечение информированности субъектов предпринимательства об исчерпывающем перечне требований, обязательных для осуществления ими деятельности».</w:t>
+      </w:r>
+    </w:p>
+    <w:p>
+      <w:pPr>
+        <w:pStyle w:val="ListParagraph"/>
+        <w:numPr>
+          <w:ilvl w:val="0"/>
+          <w:numId w:val="2"/>
+        </w:numPr>
+        <w:spacing w:after="60"/>
+      </w:pPr>
+      <w:r>
+        <w:rPr>
+          <w:b/>
+          <w:bCs/>
+          <w:sz w:val="22"/>
+          <w:szCs w:val="22"/>
+        </w:rPr>
+        <w:t xml:space="preserve">Порядок включения (п. 5): </w:t>
+      </w:r>
+      <w:r>
+        <w:rPr>
+          <w:sz w:val="22"/>
+          <w:szCs w:val="22"/>
+        </w:rPr>
+        <w:t xml:space="preserve">законы — постатейно; иные НПА — по наименованиям с реквизитами.</w:t>
+      </w:r>
+    </w:p>
+    <w:p>
+      <w:pPr>
+        <w:pStyle w:val="ListParagraph"/>
+        <w:numPr>
+          <w:ilvl w:val="0"/>
+          <w:numId w:val="2"/>
+        </w:numPr>
+        <w:spacing w:after="60"/>
+      </w:pPr>
+      <w:r>
+        <w:rPr>
+          <w:b/>
+          <w:bCs/>
+          <w:sz w:val="22"/>
+          <w:szCs w:val="22"/>
+        </w:rPr>
+        <w:t xml:space="preserve">Правовое последствие (п. 6): </w:t>
+      </w:r>
+      <w:r>
+        <w:rPr>
+          <w:sz w:val="22"/>
+          <w:szCs w:val="22"/>
+        </w:rPr>
+        <w:t xml:space="preserve">если регулирующий орган своевременно не провёл анализ регуляторного акта, акт исключается из реестра.</w:t>
+      </w:r>
+    </w:p>
+    <w:p>
+      <w:pPr>
+        <w:spacing w:after="120" w:line="276"/>
+      </w:pPr>
+      <w:r>
+        <w:rPr>
+          <w:b/>
+          <w:bCs/>
+          <w:sz w:val="22"/>
+          <w:szCs w:val="22"/>
+        </w:rPr>
+        <w:t xml:space="preserve">Вывод из нормы. </w:t>
+      </w:r>
+      <w:r>
+        <w:rPr>
+          <w:sz w:val="22"/>
+          <w:szCs w:val="22"/>
+        </w:rPr>
+        <w:t xml:space="preserve">Закон прямо называет реестр «общедоступной базой данных» и НЕ требует хранить полный текст требований на самом портале — достаточно включения актов (законы — постатейно) с доступом к их тексту. Однако ключевая задача — «информированность об </w:t>
+      </w:r>
+      <w:r>
+        <w:rPr>
+          <w:i/>
+          <w:iCs/>
+          <w:sz w:val="22"/>
+          <w:szCs w:val="22"/>
+        </w:rPr>
+        <w:t xml:space="preserve">исчерпывающем</w:t>
+      </w:r>
+      <w:r>
+        <w:rPr>
+          <w:sz w:val="22"/>
+          <w:szCs w:val="22"/>
+        </w:rPr>
+        <w:t xml:space="preserve"> перечне требований». Именно по этой задаче фактическая реализация даёт сбой (см. ниже).</w:t>
+      </w:r>
+    </w:p>
+    <w:p>
+      <w:pPr>
+        <w:spacing w:after="120" w:line="276"/>
+      </w:pPr>
+      <w:r>
+        <w:rPr>
+          <w:b/>
+          <w:bCs/>
+          <w:sz w:val="22"/>
+          <w:szCs w:val="22"/>
+        </w:rPr>
+        <w:t xml:space="preserve">Формальное соответствие против сущностного. </w:t>
+      </w:r>
+      <w:r>
+        <w:rPr>
+          <w:sz w:val="22"/>
+          <w:szCs w:val="22"/>
+        </w:rPr>
+        <w:t xml:space="preserve">Наблюдаемые на портале графы карточки (регуляторный акт, ОКЭД, госорган, срок анализа, гиперссылка, досье, статус) формально соответствуют структуре, установленной правилами ведения реестра (утверждены приказом уполномоченного органа по предпринимательству — МНЭ РК). Таким образом, </w:t>
+      </w:r>
+    </w:p>
+    <w:tbl>
+      <w:tblPr>
+        <w:tblW w:type="dxa" w:w="8600"/>
+        <w:tblBorders>
+          <w:top w:val="single" w:color="BBBBBB" w:sz="4"/>
+          <w:left w:val="single" w:color="BBBBBB" w:sz="4"/>
+          <w:bottom w:val="single" w:color="BBBBBB" w:sz="4"/>
+          <w:right w:val="single" w:color="BBBBBB" w:sz="4"/>
+          <w:insideH w:val="single" w:color="BBBBBB" w:sz="4"/>
+          <w:insideV w:val="single" w:color="BBBBBB" w:sz="4"/>
+        </w:tblBorders>
+      </w:tblPr>
+      <w:tblGrid>
+        <w:gridCol w:w="4200"/>
+        <w:gridCol w:w="1500"/>
+        <w:gridCol w:w="2900"/>
+      </w:tblGrid>
+      <w:tr>
+        <w:trPr>
+          <w:tblHeader/>
+        </w:trPr>
+        <w:tc>
+          <w:tcPr>
+            <w:tcW w:type="dxa" w:w="4200"/>
+            <w:shd w:fill="1F3864" w:color="auto" w:val="clear"/>
+            <w:tcMar>
+              <w:top w:type="dxa" w:w="40"/>
+              <w:left w:type="dxa" w:w="80"/>
+              <w:bottom w:type="dxa" w:w="40"/>
+              <w:right w:type="dxa" w:w="80"/>
+            </w:tcMar>
+          </w:tcPr>
+          <w:p>
+            <w:pPr>
+              <w:jc w:val="left"/>
+            </w:pPr>
+            <w:r>
+              <w:rPr>
+                <w:b/>
+                <w:bCs/>
+                <w:color w:val="FFFFFF"/>
+                <w:sz w:val="18"/>
+                <w:szCs w:val="18"/>
+              </w:rPr>
+              <w:t xml:space="preserve">Плоскость оценки</w:t>
+            </w:r>
+          </w:p>
+        </w:tc>
+        <w:tc>
+          <w:tcPr>
+            <w:tcW w:type="dxa" w:w="1500"/>
+            <w:shd w:fill="1F3864" w:color="auto" w:val="clear"/>
+            <w:tcMar>
+              <w:top w:type="dxa" w:w="40"/>
+              <w:left w:type="dxa" w:w="80"/>
+              <w:bottom w:type="dxa" w:w="40"/>
+              <w:right w:type="dxa" w:w="80"/>
+            </w:tcMar>
+          </w:tcPr>
+          <w:p>
+            <w:pPr>
+              <w:jc w:val="center"/>
+            </w:pPr>
+            <w:r>
+              <w:rPr>
+                <w:b/>
+                <w:bCs/>
+                <w:color w:val="FFFFFF"/>
+                <w:sz w:val="18"/>
+                <w:szCs w:val="18"/>
+              </w:rPr>
+              <w:t xml:space="preserve">Итог</w:t>
+            </w:r>
+          </w:p>
+        </w:tc>
+        <w:tc>
+          <w:tcPr>
+            <w:tcW w:type="dxa" w:w="2900"/>
+            <w:shd w:fill="1F3864" w:color="auto" w:val="clear"/>
+            <w:tcMar>
+              <w:top w:type="dxa" w:w="40"/>
+              <w:left w:type="dxa" w:w="80"/>
+              <w:bottom w:type="dxa" w:w="40"/>
+              <w:right w:type="dxa" w:w="80"/>
+            </w:tcMar>
+          </w:tcPr>
+          <w:p>
+            <w:pPr>
+              <w:jc w:val="left"/>
+            </w:pPr>
+            <w:r>
+              <w:rPr>
+                <w:b/>
+                <w:bCs/>
+                <w:color w:val="FFFFFF"/>
+                <w:sz w:val="18"/>
+                <w:szCs w:val="18"/>
+              </w:rPr>
+              <w:t xml:space="preserve">Обоснование</w:t>
+            </w:r>
+          </w:p>
+        </w:tc>
+      </w:tr>
+      <w:tr>
+        <w:tc>
+          <w:tcPr>
+            <w:tcW w:type="dxa" w:w="4200"/>
+            <w:tcMar>
+              <w:top w:type="dxa" w:w="40"/>
+              <w:left w:type="dxa" w:w="80"/>
+              <w:bottom w:type="dxa" w:w="40"/>
+              <w:right w:type="dxa" w:w="80"/>
+            </w:tcMar>
+          </w:tcPr>
+          <w:p>
+            <w:pPr>
+              <w:jc w:val="left"/>
+            </w:pPr>
+            <w:r>
+              <w:rPr>
+                <w:sz w:val="18"/>
+                <w:szCs w:val="18"/>
+              </w:rPr>
+              <w:t xml:space="preserve">Формальное соответствие (структура граф)</w:t>
+            </w:r>
+          </w:p>
+        </w:tc>
+        <w:tc>
+          <w:tcPr>
+            <w:tcW w:type="dxa" w:w="1500"/>
+            <w:tcMar>
+              <w:top w:type="dxa" w:w="40"/>
+              <w:left w:type="dxa" w:w="80"/>
+              <w:bottom w:type="dxa" w:w="40"/>
+              <w:right w:type="dxa" w:w="80"/>
+            </w:tcMar>
+          </w:tcPr>
+          <w:p>
+            <w:pPr>
+              <w:jc w:val="center"/>
+            </w:pPr>
+            <w:r>
+              <w:rPr>
+                <w:b/>
+                <w:bCs/>
+                <w:color w:val="B26A00"/>
+                <w:sz w:val="18"/>
+                <w:szCs w:val="18"/>
+              </w:rPr>
+              <w:t xml:space="preserve">≈ 7 / 10</w:t>
+            </w:r>
+          </w:p>
+        </w:tc>
+        <w:tc>
+          <w:tcPr>
+            <w:tcW w:type="dxa" w:w="2900"/>
+            <w:tcMar>
+              <w:top w:type="dxa" w:w="40"/>
+              <w:left w:type="dxa" w:w="80"/>
+              <w:bottom w:type="dxa" w:w="40"/>
+              <w:right w:type="dxa" w:w="80"/>
+            </w:tcMar>
+          </w:tcPr>
+          <w:p>
+            <w:pPr>
+              <w:jc w:val="left"/>
+            </w:pPr>
+            <w:r>
+              <w:rPr>
+                <w:sz w:val="18"/>
+                <w:szCs w:val="18"/>
+              </w:rPr>
+              <w:t xml:space="preserve">Все обязательные графы присутствуют, но гиперссылка в ~88 % нерабочая</w:t>
+            </w:r>
+          </w:p>
+        </w:tc>
+      </w:tr>
+      <w:tr>
+        <w:tc>
+          <w:tcPr>
+            <w:tcW w:type="dxa" w:w="4200"/>
+            <w:tcMar>
+              <w:top w:type="dxa" w:w="40"/>
+              <w:left w:type="dxa" w:w="80"/>
+              <w:bottom w:type="dxa" w:w="40"/>
+              <w:right w:type="dxa" w:w="80"/>
+            </w:tcMar>
+          </w:tcPr>
+          <w:p>
+            <w:pPr>
+              <w:jc w:val="left"/>
+            </w:pPr>
+            <w:r>
+              <w:rPr>
+                <w:sz w:val="18"/>
+                <w:szCs w:val="18"/>
+              </w:rPr>
+              <w:t xml:space="preserve">Сущностное соответствие (задача информированности, п.1 ст.83-1)</w:t>
+            </w:r>
+          </w:p>
+        </w:tc>
+        <w:tc>
+          <w:tcPr>
+            <w:tcW w:type="dxa" w:w="1500"/>
+            <w:tcMar>
+              <w:top w:type="dxa" w:w="40"/>
+              <w:left w:type="dxa" w:w="80"/>
+              <w:bottom w:type="dxa" w:w="40"/>
+              <w:right w:type="dxa" w:w="80"/>
+            </w:tcMar>
+          </w:tcPr>
+          <w:p>
+            <w:pPr>
+              <w:jc w:val="center"/>
+            </w:pPr>
+            <w:r>
+              <w:rPr>
+                <w:b/>
+                <w:bCs/>
+                <w:color w:val="C00000"/>
+                <w:sz w:val="18"/>
+                <w:szCs w:val="18"/>
+              </w:rPr>
+              <w:t xml:space="preserve">≈ 2 / 10</w:t>
+            </w:r>
+          </w:p>
+        </w:tc>
+        <w:tc>
+          <w:tcPr>
+            <w:tcW w:type="dxa" w:w="2900"/>
+            <w:tcMar>
+              <w:top w:type="dxa" w:w="40"/>
+              <w:left w:type="dxa" w:w="80"/>
+              <w:bottom w:type="dxa" w:w="40"/>
+              <w:right w:type="dxa" w:w="80"/>
+            </w:tcMar>
+          </w:tcPr>
+          <w:p>
+            <w:pPr>
+              <w:jc w:val="left"/>
+            </w:pPr>
+            <w:r>
+              <w:rPr>
+                <w:sz w:val="18"/>
+                <w:szCs w:val="18"/>
+              </w:rPr>
+              <w:t xml:space="preserve">Исчерпывающий перечень фактически недоступен: 87,7 % ссылок ведут на недостижимые внутренние IP</w:t>
+            </w:r>
+          </w:p>
+        </w:tc>
+      </w:tr>
+    </w:tbl>
+    <w:p>
+      <w:pPr>
+        <w:spacing w:after="120" w:line="276"/>
+      </w:pPr>
+      <w:r>
+        <w:rPr>
+          <w:b/>
+          <w:bCs/>
+          <w:sz w:val="22"/>
+          <w:szCs w:val="22"/>
+        </w:rPr>
+        <w:t xml:space="preserve">Правовой риск (п. 6 ст. 83-1). </w:t>
+      </w:r>
+      <w:r>
+        <w:rPr>
+          <w:sz w:val="22"/>
+          <w:szCs w:val="22"/>
+        </w:rPr>
+        <w:t xml:space="preserve">Поскольку статус акта в реестре влечёт правовые последствия (исключённый из реестра акт меняет режим применения его требований), нерабочие ссылки и невозможность верифицировать источник создают для предпринимателя правовую неопределённость.</w:t>
+      </w:r>
+    </w:p>
+    <w:p>
+      <w:pPr>
+        <w:pStyle w:val="Heading2"/>
+        <w:spacing w:after="100" w:before="220"/>
+      </w:pPr>
+      <w:r>
+        <w:t xml:space="preserve">10.2. Возможности, ожидаемые от реестра требований</w:t>
       </w:r>
     </w:p>
     <w:tbl>
@@ -9248,7 +9729,7 @@
         <w:spacing w:after="100" w:before="220"/>
       </w:pPr>
       <w:r>
-        <w:t xml:space="preserve">Архитектурные выводы</w:t>
+        <w:t xml:space="preserve">10.3. Архитектурные выводы</w:t>
       </w:r>
     </w:p>
     <w:p>
@@ -9708,1231 +10189,7 @@
         <w:spacing w:after="120" w:before="280"/>
       </w:pPr>
       <w:r>
-        <w:t xml:space="preserve">13. Сравнение с независимыми заключениями (Gemini, Qwen)</w:t>
-      </w:r>
-    </w:p>
-    <w:p>
-      <w:pPr>
-        <w:spacing w:after="120" w:line="276"/>
-      </w:pPr>
-      <w:r>
-        <w:rPr>
-          <w:sz w:val="22"/>
-          <w:szCs w:val="22"/>
-        </w:rPr>
-        <w:t xml:space="preserve">Ниже — сопоставление трёх независимых заключений с фактическими наблюдениями данного аудита. Все три сходятся в главном (портал — каталог ссылок; масса ссылок ведёт на внутренние IP; назначению не соответствует), но существенно различаются по фактической точности и глубине.</w:t>
-      </w:r>
-    </w:p>
-    <w:tbl>
-      <w:tblPr>
-        <w:tblW w:type="dxa" w:w="8600"/>
-        <w:tblBorders>
-          <w:top w:val="single" w:color="BBBBBB" w:sz="4"/>
-          <w:left w:val="single" w:color="BBBBBB" w:sz="4"/>
-          <w:bottom w:val="single" w:color="BBBBBB" w:sz="4"/>
-          <w:right w:val="single" w:color="BBBBBB" w:sz="4"/>
-          <w:insideH w:val="single" w:color="BBBBBB" w:sz="4"/>
-          <w:insideV w:val="single" w:color="BBBBBB" w:sz="4"/>
-        </w:tblBorders>
-      </w:tblPr>
-      <w:tblGrid>
-        <w:gridCol w:w="2200"/>
-        <w:gridCol w:w="2200"/>
-        <w:gridCol w:w="2000"/>
-        <w:gridCol w:w="2200"/>
-      </w:tblGrid>
-      <w:tr>
-        <w:trPr>
-          <w:tblHeader/>
-        </w:trPr>
-        <w:tc>
-          <w:tcPr>
-            <w:tcW w:type="dxa" w:w="2200"/>
-            <w:shd w:fill="1F3864" w:color="auto" w:val="clear"/>
-            <w:tcMar>
-              <w:top w:type="dxa" w:w="40"/>
-              <w:left w:type="dxa" w:w="80"/>
-              <w:bottom w:type="dxa" w:w="40"/>
-              <w:right w:type="dxa" w:w="80"/>
-            </w:tcMar>
-          </w:tcPr>
-          <w:p>
-            <w:pPr>
-              <w:jc w:val="left"/>
-            </w:pPr>
-            <w:r>
-              <w:rPr>
-                <w:b/>
-                <w:bCs/>
-                <w:color w:val="FFFFFF"/>
-                <w:sz w:val="18"/>
-                <w:szCs w:val="18"/>
-              </w:rPr>
-              <w:t xml:space="preserve">Аспект</w:t>
-            </w:r>
-          </w:p>
-        </w:tc>
-        <w:tc>
-          <w:tcPr>
-            <w:tcW w:type="dxa" w:w="2200"/>
-            <w:shd w:fill="1F3864" w:color="auto" w:val="clear"/>
-            <w:tcMar>
-              <w:top w:type="dxa" w:w="40"/>
-              <w:left w:type="dxa" w:w="80"/>
-              <w:bottom w:type="dxa" w:w="40"/>
-              <w:right w:type="dxa" w:w="80"/>
-            </w:tcMar>
-          </w:tcPr>
-          <w:p>
-            <w:pPr>
-              <w:jc w:val="left"/>
-            </w:pPr>
-            <w:r>
-              <w:rPr>
-                <w:b/>
-                <w:bCs/>
-                <w:color w:val="FFFFFF"/>
-                <w:sz w:val="18"/>
-                <w:szCs w:val="18"/>
-              </w:rPr>
-              <w:t xml:space="preserve">Gemini</w:t>
-            </w:r>
-          </w:p>
-        </w:tc>
-        <w:tc>
-          <w:tcPr>
-            <w:tcW w:type="dxa" w:w="2000"/>
-            <w:shd w:fill="1F3864" w:color="auto" w:val="clear"/>
-            <w:tcMar>
-              <w:top w:type="dxa" w:w="40"/>
-              <w:left w:type="dxa" w:w="80"/>
-              <w:bottom w:type="dxa" w:w="40"/>
-              <w:right w:type="dxa" w:w="80"/>
-            </w:tcMar>
-          </w:tcPr>
-          <w:p>
-            <w:pPr>
-              <w:jc w:val="left"/>
-            </w:pPr>
-            <w:r>
-              <w:rPr>
-                <w:b/>
-                <w:bCs/>
-                <w:color w:val="FFFFFF"/>
-                <w:sz w:val="18"/>
-                <w:szCs w:val="18"/>
-              </w:rPr>
-              <w:t xml:space="preserve">Qwen</w:t>
-            </w:r>
-          </w:p>
-        </w:tc>
-        <w:tc>
-          <w:tcPr>
-            <w:tcW w:type="dxa" w:w="2200"/>
-            <w:shd w:fill="1F3864" w:color="auto" w:val="clear"/>
-            <w:tcMar>
-              <w:top w:type="dxa" w:w="40"/>
-              <w:left w:type="dxa" w:w="80"/>
-              <w:bottom w:type="dxa" w:w="40"/>
-              <w:right w:type="dxa" w:w="80"/>
-            </w:tcMar>
-          </w:tcPr>
-          <w:p>
-            <w:pPr>
-              <w:jc w:val="left"/>
-            </w:pPr>
-            <w:r>
-              <w:rPr>
-                <w:b/>
-                <w:bCs/>
-                <w:color w:val="FFFFFF"/>
-                <w:sz w:val="18"/>
-                <w:szCs w:val="18"/>
-              </w:rPr>
-              <w:t xml:space="preserve">Факт (данный аудит)</w:t>
-            </w:r>
-          </w:p>
-        </w:tc>
-      </w:tr>
-      <w:tr>
-        <w:tc>
-          <w:tcPr>
-            <w:tcW w:type="dxa" w:w="2200"/>
-            <w:tcMar>
-              <w:top w:type="dxa" w:w="40"/>
-              <w:left w:type="dxa" w:w="80"/>
-              <w:bottom w:type="dxa" w:w="40"/>
-              <w:right w:type="dxa" w:w="80"/>
-            </w:tcMar>
-          </w:tcPr>
-          <w:p>
-            <w:pPr>
-              <w:jc w:val="left"/>
-            </w:pPr>
-            <w:r>
-              <w:rPr>
-                <w:sz w:val="18"/>
-                <w:szCs w:val="18"/>
-              </w:rPr>
-              <w:t xml:space="preserve">Архитектура</w:t>
-            </w:r>
-          </w:p>
-        </w:tc>
-        <w:tc>
-          <w:tcPr>
-            <w:tcW w:type="dxa" w:w="2200"/>
-            <w:tcMar>
-              <w:top w:type="dxa" w:w="40"/>
-              <w:left w:type="dxa" w:w="80"/>
-              <w:bottom w:type="dxa" w:w="40"/>
-              <w:right w:type="dxa" w:w="80"/>
-            </w:tcMar>
-          </w:tcPr>
-          <w:p>
-            <w:pPr>
-              <w:jc w:val="left"/>
-            </w:pPr>
-            <w:r>
-              <w:rPr>
-                <w:b/>
-                <w:bCs/>
-                <w:color w:val="C00000"/>
-                <w:sz w:val="18"/>
-                <w:szCs w:val="18"/>
-              </w:rPr>
-              <w:t xml:space="preserve">SPA (Vue/React)+API</w:t>
-            </w:r>
-          </w:p>
-        </w:tc>
-        <w:tc>
-          <w:tcPr>
-            <w:tcW w:type="dxa" w:w="2000"/>
-            <w:tcMar>
-              <w:top w:type="dxa" w:w="40"/>
-              <w:left w:type="dxa" w:w="80"/>
-              <w:bottom w:type="dxa" w:w="40"/>
-              <w:right w:type="dxa" w:w="80"/>
-            </w:tcMar>
-          </w:tcPr>
-          <w:p>
-            <w:pPr>
-              <w:jc w:val="left"/>
-            </w:pPr>
-            <w:r>
-              <w:rPr>
-                <w:sz w:val="18"/>
-                <w:szCs w:val="18"/>
-              </w:rPr>
-              <w:t xml:space="preserve">—</w:t>
-            </w:r>
-          </w:p>
-        </w:tc>
-        <w:tc>
-          <w:tcPr>
-            <w:tcW w:type="dxa" w:w="2200"/>
-            <w:tcMar>
-              <w:top w:type="dxa" w:w="40"/>
-              <w:left w:type="dxa" w:w="80"/>
-              <w:bottom w:type="dxa" w:w="40"/>
-              <w:right w:type="dxa" w:w="80"/>
-            </w:tcMar>
-          </w:tcPr>
-          <w:p>
-            <w:pPr>
-              <w:jc w:val="left"/>
-            </w:pPr>
-            <w:r>
-              <w:rPr>
-                <w:b/>
-                <w:bCs/>
-                <w:color w:val="2E7D32"/>
-                <w:sz w:val="18"/>
-                <w:szCs w:val="18"/>
-              </w:rPr>
-              <w:t xml:space="preserve">SSR Laravel+jQuery, 0 XHR</w:t>
-            </w:r>
-          </w:p>
-        </w:tc>
-      </w:tr>
-      <w:tr>
-        <w:tc>
-          <w:tcPr>
-            <w:tcW w:type="dxa" w:w="2200"/>
-            <w:tcMar>
-              <w:top w:type="dxa" w:w="40"/>
-              <w:left w:type="dxa" w:w="80"/>
-              <w:bottom w:type="dxa" w:w="40"/>
-              <w:right w:type="dxa" w:w="80"/>
-            </w:tcMar>
-          </w:tcPr>
-          <w:p>
-            <w:pPr>
-              <w:jc w:val="left"/>
-            </w:pPr>
-            <w:r>
-              <w:rPr>
-                <w:sz w:val="18"/>
-                <w:szCs w:val="18"/>
-              </w:rPr>
-              <w:t xml:space="preserve">Внутренние IP</w:t>
-            </w:r>
-          </w:p>
-        </w:tc>
-        <w:tc>
-          <w:tcPr>
-            <w:tcW w:type="dxa" w:w="2200"/>
-            <w:tcMar>
-              <w:top w:type="dxa" w:w="40"/>
-              <w:left w:type="dxa" w:w="80"/>
-              <w:bottom w:type="dxa" w:w="40"/>
-              <w:right w:type="dxa" w:w="80"/>
-            </w:tcMar>
-          </w:tcPr>
-          <w:p>
-            <w:pPr>
-              <w:jc w:val="left"/>
-            </w:pPr>
-            <w:r>
-              <w:rPr>
-                <w:b/>
-                <w:bCs/>
-                <w:color w:val="B26A00"/>
-                <w:sz w:val="18"/>
-                <w:szCs w:val="18"/>
-              </w:rPr>
-              <w:t xml:space="preserve">10.x + 192.168.x (плейсхолдеры)</w:t>
-            </w:r>
-          </w:p>
-        </w:tc>
-        <w:tc>
-          <w:tcPr>
-            <w:tcW w:type="dxa" w:w="2000"/>
-            <w:tcMar>
-              <w:top w:type="dxa" w:w="40"/>
-              <w:left w:type="dxa" w:w="80"/>
-              <w:bottom w:type="dxa" w:w="40"/>
-              <w:right w:type="dxa" w:w="80"/>
-            </w:tcMar>
-          </w:tcPr>
-          <w:p>
-            <w:pPr>
-              <w:jc w:val="left"/>
-            </w:pPr>
-            <w:r>
-              <w:rPr>
-                <w:sz w:val="18"/>
-                <w:szCs w:val="18"/>
-              </w:rPr>
-              <w:t xml:space="preserve">10.61.42.188 / .253; 72,6 %</w:t>
-            </w:r>
-          </w:p>
-        </w:tc>
-        <w:tc>
-          <w:tcPr>
-            <w:tcW w:type="dxa" w:w="2200"/>
-            <w:tcMar>
-              <w:top w:type="dxa" w:w="40"/>
-              <w:left w:type="dxa" w:w="80"/>
-              <w:bottom w:type="dxa" w:w="40"/>
-              <w:right w:type="dxa" w:w="80"/>
-            </w:tcMar>
-          </w:tcPr>
-          <w:p>
-            <w:pPr>
-              <w:jc w:val="left"/>
-            </w:pPr>
-            <w:r>
-              <w:rPr>
-                <w:b/>
-                <w:bCs/>
-                <w:color w:val="2E7D32"/>
-                <w:sz w:val="18"/>
-                <w:szCs w:val="18"/>
-              </w:rPr>
-              <w:t xml:space="preserve">10.61.42.188 + 10.61.41.253</w:t>
-            </w:r>
-          </w:p>
-        </w:tc>
-      </w:tr>
-      <w:tr>
-        <w:tc>
-          <w:tcPr>
-            <w:tcW w:type="dxa" w:w="2200"/>
-            <w:tcMar>
-              <w:top w:type="dxa" w:w="40"/>
-              <w:left w:type="dxa" w:w="80"/>
-              <w:bottom w:type="dxa" w:w="40"/>
-              <w:right w:type="dxa" w:w="80"/>
-            </w:tcMar>
-          </w:tcPr>
-          <w:p>
-            <w:pPr>
-              <w:jc w:val="left"/>
-            </w:pPr>
-            <w:r>
-              <w:rPr>
-                <w:sz w:val="18"/>
-                <w:szCs w:val="18"/>
-              </w:rPr>
-              <w:t xml:space="preserve">Протокол/ошибка</w:t>
-            </w:r>
-          </w:p>
-        </w:tc>
-        <w:tc>
-          <w:tcPr>
-            <w:tcW w:type="dxa" w:w="2200"/>
-            <w:tcMar>
-              <w:top w:type="dxa" w:w="40"/>
-              <w:left w:type="dxa" w:w="80"/>
-              <w:bottom w:type="dxa" w:w="40"/>
-              <w:right w:type="dxa" w:w="80"/>
-            </w:tcMar>
-          </w:tcPr>
-          <w:p>
-            <w:pPr>
-              <w:jc w:val="left"/>
-            </w:pPr>
-            <w:r>
-              <w:rPr>
-                <w:b/>
-                <w:bCs/>
-                <w:color w:val="C00000"/>
-                <w:sz w:val="18"/>
-                <w:szCs w:val="18"/>
-              </w:rPr>
-              <w:t xml:space="preserve">http://, TIMED_OUT/REFUSED</w:t>
-            </w:r>
-          </w:p>
-        </w:tc>
-        <w:tc>
-          <w:tcPr>
-            <w:tcW w:type="dxa" w:w="2000"/>
-            <w:tcMar>
-              <w:top w:type="dxa" w:w="40"/>
-              <w:left w:type="dxa" w:w="80"/>
-              <w:bottom w:type="dxa" w:w="40"/>
-              <w:right w:type="dxa" w:w="80"/>
-            </w:tcMar>
-          </w:tcPr>
-          <w:p>
-            <w:pPr>
-              <w:jc w:val="left"/>
-            </w:pPr>
-            <w:r>
-              <w:rPr>
-                <w:sz w:val="18"/>
-                <w:szCs w:val="18"/>
-              </w:rPr>
-              <w:t xml:space="preserve">—</w:t>
-            </w:r>
-          </w:p>
-        </w:tc>
-        <w:tc>
-          <w:tcPr>
-            <w:tcW w:type="dxa" w:w="2200"/>
-            <w:tcMar>
-              <w:top w:type="dxa" w:w="40"/>
-              <w:left w:type="dxa" w:w="80"/>
-              <w:bottom w:type="dxa" w:w="40"/>
-              <w:right w:type="dxa" w:w="80"/>
-            </w:tcMar>
-          </w:tcPr>
-          <w:p>
-            <w:pPr>
-              <w:jc w:val="left"/>
-            </w:pPr>
-            <w:r>
-              <w:rPr>
-                <w:sz w:val="18"/>
-                <w:szCs w:val="18"/>
-              </w:rPr>
-              <w:t xml:space="preserve">https://, ERR_TUNNEL_CONNECTION_FAILED</w:t>
-            </w:r>
-          </w:p>
-        </w:tc>
-      </w:tr>
-      <w:tr>
-        <w:tc>
-          <w:tcPr>
-            <w:tcW w:type="dxa" w:w="2200"/>
-            <w:tcMar>
-              <w:top w:type="dxa" w:w="40"/>
-              <w:left w:type="dxa" w:w="80"/>
-              <w:bottom w:type="dxa" w:w="40"/>
-              <w:right w:type="dxa" w:w="80"/>
-            </w:tcMar>
-          </w:tcPr>
-          <w:p>
-            <w:pPr>
-              <w:jc w:val="left"/>
-            </w:pPr>
-            <w:r>
-              <w:rPr>
-                <w:sz w:val="18"/>
-                <w:szCs w:val="18"/>
-              </w:rPr>
-              <w:t xml:space="preserve">Таблица НПА</w:t>
-            </w:r>
-          </w:p>
-        </w:tc>
-        <w:tc>
-          <w:tcPr>
-            <w:tcW w:type="dxa" w:w="2200"/>
-            <w:tcMar>
-              <w:top w:type="dxa" w:w="40"/>
-              <w:left w:type="dxa" w:w="80"/>
-              <w:bottom w:type="dxa" w:w="40"/>
-              <w:right w:type="dxa" w:w="80"/>
-            </w:tcMar>
-          </w:tcPr>
-          <w:p>
-            <w:pPr>
-              <w:jc w:val="left"/>
-            </w:pPr>
-            <w:r>
-              <w:rPr>
-                <w:b/>
-                <w:bCs/>
-                <w:color w:val="B26A00"/>
-                <w:sz w:val="18"/>
-                <w:szCs w:val="18"/>
-              </w:rPr>
-              <w:t xml:space="preserve">10 актов, цели не верифицированы</w:t>
-            </w:r>
-          </w:p>
-        </w:tc>
-        <w:tc>
-          <w:tcPr>
-            <w:tcW w:type="dxa" w:w="2000"/>
-            <w:tcMar>
-              <w:top w:type="dxa" w:w="40"/>
-              <w:left w:type="dxa" w:w="80"/>
-              <w:bottom w:type="dxa" w:w="40"/>
-              <w:right w:type="dxa" w:w="80"/>
-            </w:tcMar>
-          </w:tcPr>
-          <w:p>
-            <w:pPr>
-              <w:jc w:val="left"/>
-            </w:pPr>
-            <w:r>
-              <w:rPr>
-                <w:sz w:val="18"/>
-                <w:szCs w:val="18"/>
-              </w:rPr>
-              <w:t xml:space="preserve">—</w:t>
-            </w:r>
-          </w:p>
-        </w:tc>
-        <w:tc>
-          <w:tcPr>
-            <w:tcW w:type="dxa" w:w="2200"/>
-            <w:tcMar>
-              <w:top w:type="dxa" w:w="40"/>
-              <w:left w:type="dxa" w:w="80"/>
-              <w:bottom w:type="dxa" w:w="40"/>
-              <w:right w:type="dxa" w:w="80"/>
-            </w:tcMar>
-          </w:tcPr>
-          <w:p>
-            <w:pPr>
-              <w:jc w:val="left"/>
-            </w:pPr>
-            <w:r>
-              <w:rPr>
-                <w:sz w:val="18"/>
-                <w:szCs w:val="18"/>
-              </w:rPr>
-              <w:t xml:space="preserve">25+ актов, верифицированы</w:t>
-            </w:r>
-          </w:p>
-        </w:tc>
-      </w:tr>
-      <w:tr>
-        <w:tc>
-          <w:tcPr>
-            <w:tcW w:type="dxa" w:w="2200"/>
-            <w:tcMar>
-              <w:top w:type="dxa" w:w="40"/>
-              <w:left w:type="dxa" w:w="80"/>
-              <w:bottom w:type="dxa" w:w="40"/>
-              <w:right w:type="dxa" w:w="80"/>
-            </w:tcMar>
-          </w:tcPr>
-          <w:p>
-            <w:pPr>
-              <w:jc w:val="left"/>
-            </w:pPr>
-            <w:r>
-              <w:rPr>
-                <w:sz w:val="18"/>
-                <w:szCs w:val="18"/>
-              </w:rPr>
-              <w:t xml:space="preserve">Юридическая база</w:t>
-            </w:r>
-          </w:p>
-        </w:tc>
-        <w:tc>
-          <w:tcPr>
-            <w:tcW w:type="dxa" w:w="2200"/>
-            <w:tcMar>
-              <w:top w:type="dxa" w:w="40"/>
-              <w:left w:type="dxa" w:w="80"/>
-              <w:bottom w:type="dxa" w:w="40"/>
-              <w:right w:type="dxa" w:w="80"/>
-            </w:tcMar>
-          </w:tcPr>
-          <w:p>
-            <w:pPr>
-              <w:jc w:val="left"/>
-            </w:pPr>
-            <w:r>
-              <w:rPr>
-                <w:sz w:val="18"/>
-                <w:szCs w:val="18"/>
-              </w:rPr>
-              <w:t xml:space="preserve">обтекаемо</w:t>
-            </w:r>
-          </w:p>
-        </w:tc>
-        <w:tc>
-          <w:tcPr>
-            <w:tcW w:type="dxa" w:w="2000"/>
-            <w:tcMar>
-              <w:top w:type="dxa" w:w="40"/>
-              <w:left w:type="dxa" w:w="80"/>
-              <w:bottom w:type="dxa" w:w="40"/>
-              <w:right w:type="dxa" w:w="80"/>
-            </w:tcMar>
-          </w:tcPr>
-          <w:p>
-            <w:pPr>
-              <w:jc w:val="left"/>
-            </w:pPr>
-            <w:r>
-              <w:rPr>
-                <w:b/>
-                <w:bCs/>
-                <w:color w:val="2E7D32"/>
-                <w:sz w:val="18"/>
-                <w:szCs w:val="18"/>
-              </w:rPr>
-              <w:t xml:space="preserve">ст.83-1 ПК, Приказ МНЭ №131, 7 граф</w:t>
-            </w:r>
-          </w:p>
-        </w:tc>
-        <w:tc>
-          <w:tcPr>
-            <w:tcW w:type="dxa" w:w="2200"/>
-            <w:tcMar>
-              <w:top w:type="dxa" w:w="40"/>
-              <w:left w:type="dxa" w:w="80"/>
-              <w:bottom w:type="dxa" w:w="40"/>
-              <w:right w:type="dxa" w:w="80"/>
-            </w:tcMar>
-          </w:tcPr>
-          <w:p>
-            <w:pPr>
-              <w:jc w:val="left"/>
-            </w:pPr>
-            <w:r>
-              <w:rPr>
-                <w:sz w:val="18"/>
-                <w:szCs w:val="18"/>
-              </w:rPr>
-              <w:t xml:space="preserve">подтверждаю релевантность</w:t>
-            </w:r>
-          </w:p>
-        </w:tc>
-      </w:tr>
-      <w:tr>
-        <w:tc>
-          <w:tcPr>
-            <w:tcW w:type="dxa" w:w="2200"/>
-            <w:tcMar>
-              <w:top w:type="dxa" w:w="40"/>
-              <w:left w:type="dxa" w:w="80"/>
-              <w:bottom w:type="dxa" w:w="40"/>
-              <w:right w:type="dxa" w:w="80"/>
-            </w:tcMar>
-          </w:tcPr>
-          <w:p>
-            <w:pPr>
-              <w:jc w:val="left"/>
-            </w:pPr>
-            <w:r>
-              <w:rPr>
-                <w:sz w:val="18"/>
-                <w:szCs w:val="18"/>
-              </w:rPr>
-              <w:t xml:space="preserve">Формальное vs сущностное</w:t>
-            </w:r>
-          </w:p>
-        </w:tc>
-        <w:tc>
-          <w:tcPr>
-            <w:tcW w:type="dxa" w:w="2200"/>
-            <w:tcMar>
-              <w:top w:type="dxa" w:w="40"/>
-              <w:left w:type="dxa" w:w="80"/>
-              <w:bottom w:type="dxa" w:w="40"/>
-              <w:right w:type="dxa" w:w="80"/>
-            </w:tcMar>
-          </w:tcPr>
-          <w:p>
-            <w:pPr>
-              <w:jc w:val="left"/>
-            </w:pPr>
-            <w:r>
-              <w:rPr>
-                <w:sz w:val="18"/>
-                <w:szCs w:val="18"/>
-              </w:rPr>
-              <w:t xml:space="preserve">не различает</w:t>
-            </w:r>
-          </w:p>
-        </w:tc>
-        <w:tc>
-          <w:tcPr>
-            <w:tcW w:type="dxa" w:w="2000"/>
-            <w:tcMar>
-              <w:top w:type="dxa" w:w="40"/>
-              <w:left w:type="dxa" w:w="80"/>
-              <w:bottom w:type="dxa" w:w="40"/>
-              <w:right w:type="dxa" w:w="80"/>
-            </w:tcMar>
-          </w:tcPr>
-          <w:p>
-            <w:pPr>
-              <w:jc w:val="left"/>
-            </w:pPr>
-            <w:r>
-              <w:rPr>
-                <w:b/>
-                <w:bCs/>
-                <w:color w:val="2E7D32"/>
-                <w:sz w:val="18"/>
-                <w:szCs w:val="18"/>
-              </w:rPr>
-              <w:t xml:space="preserve">7/10 формально vs 2/10 сущностно</w:t>
-            </w:r>
-          </w:p>
-        </w:tc>
-        <w:tc>
-          <w:tcPr>
-            <w:tcW w:type="dxa" w:w="2200"/>
-            <w:tcMar>
-              <w:top w:type="dxa" w:w="40"/>
-              <w:left w:type="dxa" w:w="80"/>
-              <w:bottom w:type="dxa" w:w="40"/>
-              <w:right w:type="dxa" w:w="80"/>
-            </w:tcMar>
-          </w:tcPr>
-          <w:p>
-            <w:pPr>
-              <w:jc w:val="left"/>
-            </w:pPr>
-            <w:r>
-              <w:rPr>
-                <w:sz w:val="18"/>
-                <w:szCs w:val="18"/>
-              </w:rPr>
-              <w:t xml:space="preserve">согласен: графы есть, функции нет</w:t>
-            </w:r>
-          </w:p>
-        </w:tc>
-      </w:tr>
-      <w:tr>
-        <w:tc>
-          <w:tcPr>
-            <w:tcW w:type="dxa" w:w="2200"/>
-            <w:tcMar>
-              <w:top w:type="dxa" w:w="40"/>
-              <w:left w:type="dxa" w:w="80"/>
-              <w:bottom w:type="dxa" w:w="40"/>
-              <w:right w:type="dxa" w:w="80"/>
-            </w:tcMar>
-          </w:tcPr>
-          <w:p>
-            <w:pPr>
-              <w:jc w:val="left"/>
-            </w:pPr>
-            <w:r>
-              <w:rPr>
-                <w:sz w:val="18"/>
-                <w:szCs w:val="18"/>
-              </w:rPr>
-              <w:t xml:space="preserve">node1 disclosure</w:t>
-            </w:r>
-          </w:p>
-        </w:tc>
-        <w:tc>
-          <w:tcPr>
-            <w:tcW w:type="dxa" w:w="2200"/>
-            <w:tcMar>
-              <w:top w:type="dxa" w:w="40"/>
-              <w:left w:type="dxa" w:w="80"/>
-              <w:bottom w:type="dxa" w:w="40"/>
-              <w:right w:type="dxa" w:w="80"/>
-            </w:tcMar>
-          </w:tcPr>
-          <w:p>
-            <w:pPr>
-              <w:jc w:val="left"/>
-            </w:pPr>
-            <w:r>
-              <w:rPr>
-                <w:b/>
-                <w:bCs/>
-                <w:color w:val="C00000"/>
-                <w:sz w:val="18"/>
-                <w:szCs w:val="18"/>
-              </w:rPr>
-              <w:t xml:space="preserve">не найдено</w:t>
-            </w:r>
-          </w:p>
-        </w:tc>
-        <w:tc>
-          <w:tcPr>
-            <w:tcW w:type="dxa" w:w="2000"/>
-            <w:tcMar>
-              <w:top w:type="dxa" w:w="40"/>
-              <w:left w:type="dxa" w:w="80"/>
-              <w:bottom w:type="dxa" w:w="40"/>
-              <w:right w:type="dxa" w:w="80"/>
-            </w:tcMar>
-          </w:tcPr>
-          <w:p>
-            <w:pPr>
-              <w:jc w:val="left"/>
-            </w:pPr>
-            <w:r>
-              <w:rPr>
-                <w:sz w:val="18"/>
-                <w:szCs w:val="18"/>
-              </w:rPr>
-              <w:t xml:space="preserve">упоминает</w:t>
-            </w:r>
-          </w:p>
-        </w:tc>
-        <w:tc>
-          <w:tcPr>
-            <w:tcW w:type="dxa" w:w="2200"/>
-            <w:tcMar>
-              <w:top w:type="dxa" w:w="40"/>
-              <w:left w:type="dxa" w:w="80"/>
-              <w:bottom w:type="dxa" w:w="40"/>
-              <w:right w:type="dxa" w:w="80"/>
-            </w:tcMar>
-          </w:tcPr>
-          <w:p>
-            <w:pPr>
-              <w:jc w:val="left"/>
-            </w:pPr>
-            <w:r>
-              <w:rPr>
-                <w:b/>
-                <w:bCs/>
-                <w:color w:val="2E7D32"/>
-                <w:sz w:val="18"/>
-                <w:szCs w:val="18"/>
-              </w:rPr>
-              <w:t xml:space="preserve">подтверждено (HTML-комментарий)</w:t>
-            </w:r>
-          </w:p>
-        </w:tc>
-      </w:tr>
-      <w:tr>
-        <w:tc>
-          <w:tcPr>
-            <w:tcW w:type="dxa" w:w="2200"/>
-            <w:tcMar>
-              <w:top w:type="dxa" w:w="40"/>
-              <w:left w:type="dxa" w:w="80"/>
-              <w:bottom w:type="dxa" w:w="40"/>
-              <w:right w:type="dxa" w:w="80"/>
-            </w:tcMar>
-          </w:tcPr>
-          <w:p>
-            <w:pPr>
-              <w:jc w:val="left"/>
-            </w:pPr>
-            <w:r>
-              <w:rPr>
-                <w:sz w:val="18"/>
-                <w:szCs w:val="18"/>
-              </w:rPr>
-              <w:t xml:space="preserve">Экспозиция ИИН/ФИО</w:t>
-            </w:r>
-          </w:p>
-        </w:tc>
-        <w:tc>
-          <w:tcPr>
-            <w:tcW w:type="dxa" w:w="2200"/>
-            <w:tcMar>
-              <w:top w:type="dxa" w:w="40"/>
-              <w:left w:type="dxa" w:w="80"/>
-              <w:bottom w:type="dxa" w:w="40"/>
-              <w:right w:type="dxa" w:w="80"/>
-            </w:tcMar>
-          </w:tcPr>
-          <w:p>
-            <w:pPr>
-              <w:jc w:val="left"/>
-            </w:pPr>
-            <w:r>
-              <w:rPr>
-                <w:b/>
-                <w:bCs/>
-                <w:color w:val="C00000"/>
-                <w:sz w:val="18"/>
-                <w:szCs w:val="18"/>
-              </w:rPr>
-              <w:t xml:space="preserve">пропущено</w:t>
-            </w:r>
-          </w:p>
-        </w:tc>
-        <w:tc>
-          <w:tcPr>
-            <w:tcW w:type="dxa" w:w="2000"/>
-            <w:tcMar>
-              <w:top w:type="dxa" w:w="40"/>
-              <w:left w:type="dxa" w:w="80"/>
-              <w:bottom w:type="dxa" w:w="40"/>
-              <w:right w:type="dxa" w:w="80"/>
-            </w:tcMar>
-          </w:tcPr>
-          <w:p>
-            <w:pPr>
-              <w:jc w:val="left"/>
-            </w:pPr>
-            <w:r>
-              <w:rPr>
-                <w:sz w:val="18"/>
-                <w:szCs w:val="18"/>
-              </w:rPr>
-              <w:t xml:space="preserve">упоминает</w:t>
-            </w:r>
-          </w:p>
-        </w:tc>
-        <w:tc>
-          <w:tcPr>
-            <w:tcW w:type="dxa" w:w="2200"/>
-            <w:tcMar>
-              <w:top w:type="dxa" w:w="40"/>
-              <w:left w:type="dxa" w:w="80"/>
-              <w:bottom w:type="dxa" w:w="40"/>
-              <w:right w:type="dxa" w:w="80"/>
-            </w:tcMar>
-          </w:tcPr>
-          <w:p>
-            <w:pPr>
-              <w:jc w:val="left"/>
-            </w:pPr>
-            <w:r>
-              <w:rPr>
-                <w:sz w:val="18"/>
-                <w:szCs w:val="18"/>
-              </w:rPr>
-              <w:t xml:space="preserve">подтверждено; калибровано (раздел 5.2)</w:t>
-            </w:r>
-          </w:p>
-        </w:tc>
-      </w:tr>
-      <w:tr>
-        <w:tc>
-          <w:tcPr>
-            <w:tcW w:type="dxa" w:w="2200"/>
-            <w:tcMar>
-              <w:top w:type="dxa" w:w="40"/>
-              <w:left w:type="dxa" w:w="80"/>
-              <w:bottom w:type="dxa" w:w="40"/>
-              <w:right w:type="dxa" w:w="80"/>
-            </w:tcMar>
-          </w:tcPr>
-          <w:p>
-            <w:pPr>
-              <w:jc w:val="left"/>
-            </w:pPr>
-            <w:r>
-              <w:rPr>
-                <w:sz w:val="18"/>
-                <w:szCs w:val="18"/>
-              </w:rPr>
-              <w:t xml:space="preserve">Эндпоинты login/certificate</w:t>
-            </w:r>
-          </w:p>
-        </w:tc>
-        <w:tc>
-          <w:tcPr>
-            <w:tcW w:type="dxa" w:w="2200"/>
-            <w:tcMar>
-              <w:top w:type="dxa" w:w="40"/>
-              <w:left w:type="dxa" w:w="80"/>
-              <w:bottom w:type="dxa" w:w="40"/>
-              <w:right w:type="dxa" w:w="80"/>
-            </w:tcMar>
-          </w:tcPr>
-          <w:p>
-            <w:pPr>
-              <w:jc w:val="left"/>
-            </w:pPr>
-            <w:r>
-              <w:rPr>
-                <w:b/>
-                <w:bCs/>
-                <w:color w:val="2E7D32"/>
-                <w:sz w:val="18"/>
-                <w:szCs w:val="18"/>
-              </w:rPr>
-              <w:t xml:space="preserve">указаны (ЭЦП/QR/FaceID)</w:t>
-            </w:r>
-          </w:p>
-        </w:tc>
-        <w:tc>
-          <w:tcPr>
-            <w:tcW w:type="dxa" w:w="2000"/>
-            <w:tcMar>
-              <w:top w:type="dxa" w:w="40"/>
-              <w:left w:type="dxa" w:w="80"/>
-              <w:bottom w:type="dxa" w:w="40"/>
-              <w:right w:type="dxa" w:w="80"/>
-            </w:tcMar>
-          </w:tcPr>
-          <w:p>
-            <w:pPr>
-              <w:jc w:val="left"/>
-            </w:pPr>
-            <w:r>
-              <w:rPr>
-                <w:sz w:val="18"/>
-                <w:szCs w:val="18"/>
-              </w:rPr>
-              <w:t xml:space="preserve">—</w:t>
-            </w:r>
-          </w:p>
-        </w:tc>
-        <w:tc>
-          <w:tcPr>
-            <w:tcW w:type="dxa" w:w="2200"/>
-            <w:tcMar>
-              <w:top w:type="dxa" w:w="40"/>
-              <w:left w:type="dxa" w:w="80"/>
-              <w:bottom w:type="dxa" w:w="40"/>
-              <w:right w:type="dxa" w:w="80"/>
-            </w:tcMar>
-          </w:tcPr>
-          <w:p>
-            <w:pPr>
-              <w:jc w:val="left"/>
-            </w:pPr>
-            <w:r>
-              <w:rPr>
-                <w:b/>
-                <w:bCs/>
-                <w:color w:val="2E7D32"/>
-                <w:sz w:val="18"/>
-                <w:szCs w:val="18"/>
-              </w:rPr>
-              <w:t xml:space="preserve">верно (HTTP 200)</w:t>
-            </w:r>
-          </w:p>
-        </w:tc>
-      </w:tr>
-      <w:tr>
-        <w:tc>
-          <w:tcPr>
-            <w:tcW w:type="dxa" w:w="2200"/>
-            <w:tcMar>
-              <w:top w:type="dxa" w:w="40"/>
-              <w:left w:type="dxa" w:w="80"/>
-              <w:bottom w:type="dxa" w:w="40"/>
-              <w:right w:type="dxa" w:w="80"/>
-            </w:tcMar>
-          </w:tcPr>
-          <w:p>
-            <w:pPr>
-              <w:jc w:val="left"/>
-            </w:pPr>
-            <w:r>
-              <w:rPr>
-                <w:sz w:val="18"/>
-                <w:szCs w:val="18"/>
-              </w:rPr>
-              <w:t xml:space="preserve">Итоговый балл</w:t>
-            </w:r>
-          </w:p>
-        </w:tc>
-        <w:tc>
-          <w:tcPr>
-            <w:tcW w:type="dxa" w:w="2200"/>
-            <w:tcMar>
-              <w:top w:type="dxa" w:w="40"/>
-              <w:left w:type="dxa" w:w="80"/>
-              <w:bottom w:type="dxa" w:w="40"/>
-              <w:right w:type="dxa" w:w="80"/>
-            </w:tcMar>
-          </w:tcPr>
-          <w:p>
-            <w:pPr>
-              <w:jc w:val="left"/>
-            </w:pPr>
-            <w:r>
-              <w:rPr>
-                <w:sz w:val="18"/>
-                <w:szCs w:val="18"/>
-              </w:rPr>
-              <w:t xml:space="preserve">2,6 / 10</w:t>
-            </w:r>
-          </w:p>
-        </w:tc>
-        <w:tc>
-          <w:tcPr>
-            <w:tcW w:type="dxa" w:w="2000"/>
-            <w:tcMar>
-              <w:top w:type="dxa" w:w="40"/>
-              <w:left w:type="dxa" w:w="80"/>
-              <w:bottom w:type="dxa" w:w="40"/>
-              <w:right w:type="dxa" w:w="80"/>
-            </w:tcMar>
-          </w:tcPr>
-          <w:p>
-            <w:pPr>
-              <w:jc w:val="left"/>
-            </w:pPr>
-            <w:r>
-              <w:rPr>
-                <w:sz w:val="18"/>
-                <w:szCs w:val="18"/>
-              </w:rPr>
-              <w:t xml:space="preserve">2/10 (сущностно) · 7/10 (формально)</w:t>
-            </w:r>
-          </w:p>
-        </w:tc>
-        <w:tc>
-          <w:tcPr>
-            <w:tcW w:type="dxa" w:w="2200"/>
-            <w:tcMar>
-              <w:top w:type="dxa" w:w="40"/>
-              <w:left w:type="dxa" w:w="80"/>
-              <w:bottom w:type="dxa" w:w="40"/>
-              <w:right w:type="dxa" w:w="80"/>
-            </w:tcMar>
-          </w:tcPr>
-          <w:p>
-            <w:pPr>
-              <w:jc w:val="left"/>
-            </w:pPr>
-            <w:r>
-              <w:rPr>
-                <w:sz w:val="18"/>
-                <w:szCs w:val="18"/>
-              </w:rPr>
-              <w:t xml:space="preserve">≈ 2,0 / 10</w:t>
-            </w:r>
-          </w:p>
-        </w:tc>
-      </w:tr>
-    </w:tbl>
-    <w:p>
-      <w:pPr>
-        <w:pStyle w:val="Heading2"/>
-        <w:spacing w:after="100" w:before="220"/>
-      </w:pPr>
-      <w:r>
-        <w:t xml:space="preserve">Выводы сравнения</w:t>
-      </w:r>
-    </w:p>
-    <w:p>
-      <w:pPr>
-        <w:pStyle w:val="ListParagraph"/>
-        <w:numPr>
-          <w:ilvl w:val="0"/>
-          <w:numId w:val="2"/>
-        </w:numPr>
-        <w:spacing w:after="60"/>
-      </w:pPr>
-      <w:r>
-        <w:rPr>
-          <w:b/>
-          <w:bCs/>
-          <w:sz w:val="22"/>
-          <w:szCs w:val="22"/>
-        </w:rPr>
-        <w:t xml:space="preserve">Qwen — сильнее в праве: </w:t>
-      </w:r>
-      <w:r>
-        <w:rPr>
-          <w:sz w:val="22"/>
-          <w:szCs w:val="22"/>
-        </w:rPr>
-        <w:t xml:space="preserve">единственный привязал оценку к конкретным НПА (ст. 83-1 Предпринимательского кодекса, Приказ МНЭ № 131 с 7 обязательными графами) и ввёл важное различие «формальное соответствие (7/10) против сущностного (2/10)». Его проверяемые технические факты (реальные IP, 72,6 %, node1, ИИН/БИН) совпадают с наблюдениями данного аудита.</w:t>
-      </w:r>
-    </w:p>
-    <w:p>
-      <w:pPr>
-        <w:pStyle w:val="ListParagraph"/>
-        <w:numPr>
-          <w:ilvl w:val="0"/>
-          <w:numId w:val="2"/>
-        </w:numPr>
-        <w:spacing w:after="60"/>
-      </w:pPr>
-      <w:r>
-        <w:rPr>
-          <w:b/>
-          <w:bCs/>
-          <w:sz w:val="22"/>
-          <w:szCs w:val="22"/>
-        </w:rPr>
-        <w:t xml:space="preserve">Gemini — слабее в фактах: </w:t>
-      </w:r>
-      <w:r>
-        <w:rPr>
-          <w:sz w:val="22"/>
-          <w:szCs w:val="22"/>
-        </w:rPr>
-        <w:t xml:space="preserve">верно уловил общий диагноз, структуру разделов и служебные эндпоинты, но ошибся в архитектуре (SPA/API вместо SSR), использовал выдуманные 192.168.* и http://, привёл непроверенную таблицу НПА и не заметил двух реальных ИБ-моментов (node1 и экспозицию ИИН). Гипотеза «остатки тестового контура» правдоподобна, но не подкреплена данными.</w:t>
-      </w:r>
-    </w:p>
-    <w:p>
-      <w:pPr>
-        <w:pStyle w:val="ListParagraph"/>
-        <w:numPr>
-          <w:ilvl w:val="0"/>
-          <w:numId w:val="2"/>
-        </w:numPr>
-        <w:spacing w:after="60"/>
-      </w:pPr>
-      <w:r>
-        <w:rPr>
-          <w:b/>
-          <w:bCs/>
-          <w:sz w:val="22"/>
-          <w:szCs w:val="22"/>
-        </w:rPr>
-        <w:t xml:space="preserve">Данный аудит — «наземная правда»: </w:t>
-      </w:r>
-      <w:r>
-        <w:rPr>
-          <w:sz w:val="22"/>
-          <w:szCs w:val="22"/>
-        </w:rPr>
-        <w:t xml:space="preserve">точные IP, реальный тип ошибки, подтверждённый SSR (не SPA), раскрытие node1 и калиброванная (не завышенная) оценка ситуации с ИИН/БИН.</w:t>
-      </w:r>
-    </w:p>
-    <w:p>
-      <w:r>
-        <w:br w:type="page"/>
-      </w:r>
-    </w:p>
-    <w:p>
-      <w:pPr>
-        <w:pStyle w:val="Heading1"/>
-        <w:spacing w:after="120" w:before="280"/>
-      </w:pPr>
-      <w:r>
-        <w:t xml:space="preserve">14. Итоговая экспертная оценка (10-балльная шкала)</w:t>
+        <w:t xml:space="preserve">13. Итоговая экспертная оценка (10-балльная шкала)</w:t>
       </w:r>
     </w:p>
     <w:tbl>
@@ -11624,14 +10881,14 @@
           <w:sz w:val="22"/>
           <w:szCs w:val="22"/>
         </w:rPr>
-        <w:t xml:space="preserve">Примечание (рамка Qwen). </w:t>
+        <w:t xml:space="preserve">Примечание. </w:t>
       </w:r>
       <w:r>
         <w:rPr>
           <w:sz w:val="22"/>
           <w:szCs w:val="22"/>
         </w:rPr>
-        <w:t xml:space="preserve">Отдельно стоит различать формальное соответствие подзаконному акту (Приказ МНЭ № 131 — все 7 граф формально присутствуют, оценка ~7/10) и сущностное соответствие цели закона и поручению (информированность об исчерпывающем перечне требований — ~2/10). Данная интегральная оценка отражает именно сущностную сторону — фактическую пользу для предпринимателя.</w:t>
+        <w:t xml:space="preserve">Как показано в разделе 10, следует различать формальное соответствие структуре реестра (графы формально присутствуют — ~7/10) и сущностное соответствие задаче закона (информированность об исчерпывающем перечне требований — ~2/10). Данная интегральная оценка отражает именно сущностную сторону — фактическую пользу для предпринимателя.</w:t>
       </w:r>
     </w:p>
     <w:p>
@@ -11640,7 +10897,7 @@
         <w:spacing w:after="120" w:before="280"/>
       </w:pPr>
       <w:r>
-        <w:t xml:space="preserve">15. Технические причины и рекомендации</w:t>
+        <w:t xml:space="preserve">14. Технические причины и рекомендации</w:t>
       </w:r>
     </w:p>
     <w:p>
@@ -11649,7 +10906,7 @@
         <w:spacing w:after="100" w:before="220"/>
       </w:pPr>
       <w:r>
-        <w:t xml:space="preserve">15.1. Причины</w:t>
+        <w:t xml:space="preserve">14.1. Причины</w:t>
       </w:r>
     </w:p>
     <w:p>
@@ -11726,7 +10983,7 @@
         <w:spacing w:after="100" w:before="220"/>
       </w:pPr>
       <w:r>
-        <w:t xml:space="preserve">15.2. Рекомендации (по приоритету)</w:t>
+        <w:t xml:space="preserve">14.2. Рекомендации (по приоритету)</w:t>
       </w:r>
     </w:p>
     <w:p>

</xml_diff>